<commit_message>
Remove LMS from requirements and progress summary
Co-authored-by: Cursor <cursoragent@cursor.com>
</commit_message>
<xml_diff>
--- a/docs/SMS-ERP-Requirements-and-Progress.docx
+++ b/docs/SMS-ERP-Requirements-and-Progress.docx
@@ -73,7 +73,7 @@
           <w:sz w:val="22"/>
           <w:szCs w:val="22"/>
         </w:rPr>
-        <w:t xml:space="preserve"> ManageIT, the Storage Management Systems (SMS) ERP, including the LMS Scope of Work link-up</w:t>
+        <w:t xml:space="preserve"> ManageIT, the Storage Management Systems (SMS) ERP</w:t>
       </w:r>
       <w:r>
         <w:rPr>
@@ -121,7 +121,7 @@
           <w:sz w:val="22"/>
           <w:szCs w:val="22"/>
         </w:rPr>
-        <w:pict w14:anchorId="078BE523">
+        <w:pict w14:anchorId="5E23FD7B">
           <v:rect id="_x0000_i1025" style="width:0;height:1.5pt" o:hralign="center" o:hrstd="t" o:hr="t" fillcolor="#a0a0a0" stroked="f"/>
         </w:pict>
       </w:r>
@@ -162,46 +162,6 @@
     </w:p>
     <w:p>
       <w:pPr>
-        <w:pStyle w:val="NormalWeb"/>
-        <w:rPr>
-          <w:rFonts w:ascii="Calibri" w:hAnsi="Calibri" w:cs="Calibri"/>
-          <w:color w:val="1F2937"/>
-          <w:sz w:val="22"/>
-          <w:szCs w:val="22"/>
-        </w:rPr>
-      </w:pPr>
-      <w:r>
-        <w:rPr>
-          <w:rFonts w:ascii="Calibri" w:hAnsi="Calibri" w:cs="Calibri"/>
-          <w:color w:val="1F2937"/>
-          <w:sz w:val="22"/>
-          <w:szCs w:val="22"/>
-        </w:rPr>
-        <w:t xml:space="preserve">The same login also gives access to </w:t>
-      </w:r>
-      <w:r>
-        <w:rPr>
-          <w:rFonts w:ascii="Calibri" w:hAnsi="Calibri" w:cs="Calibri"/>
-          <w:b/>
-          <w:bCs/>
-          <w:color w:val="1F2937"/>
-          <w:sz w:val="22"/>
-          <w:szCs w:val="22"/>
-        </w:rPr>
-        <w:t>LMS</w:t>
-      </w:r>
-      <w:r>
-        <w:rPr>
-          <w:rFonts w:ascii="Calibri" w:hAnsi="Calibri" w:cs="Calibri"/>
-          <w:color w:val="1F2937"/>
-          <w:sz w:val="22"/>
-          <w:szCs w:val="22"/>
-        </w:rPr>
-        <w:t xml:space="preserve"> (Liquid Management Systems) through its Scope of Work app.</w:t>
-      </w:r>
-    </w:p>
-    <w:p>
-      <w:pPr>
         <w:rPr>
           <w:rFonts w:ascii="Calibri" w:eastAsia="Times New Roman" w:hAnsi="Calibri" w:cs="Calibri"/>
           <w:color w:val="1F2937"/>
@@ -216,7 +176,7 @@
           <w:sz w:val="22"/>
           <w:szCs w:val="22"/>
         </w:rPr>
-        <w:pict w14:anchorId="1CE22045">
+        <w:pict w14:anchorId="25C03E0A">
           <v:rect id="_x0000_i1026" style="width:0;height:1.5pt" o:hralign="center" o:hrstd="t" o:hr="t" fillcolor="#a0a0a0" stroked="f"/>
         </w:pict>
       </w:r>
@@ -866,46 +826,6 @@
     </w:tbl>
     <w:p>
       <w:pPr>
-        <w:pStyle w:val="NormalWeb"/>
-        <w:rPr>
-          <w:rFonts w:ascii="Calibri" w:hAnsi="Calibri" w:cs="Calibri"/>
-          <w:color w:val="1F2937"/>
-          <w:sz w:val="22"/>
-          <w:szCs w:val="22"/>
-        </w:rPr>
-      </w:pPr>
-      <w:r>
-        <w:rPr>
-          <w:rFonts w:ascii="Calibri" w:hAnsi="Calibri" w:cs="Calibri"/>
-          <w:color w:val="1F2937"/>
-          <w:sz w:val="22"/>
-          <w:szCs w:val="22"/>
-        </w:rPr>
-        <w:t xml:space="preserve">Each user can separately be given </w:t>
-      </w:r>
-      <w:r>
-        <w:rPr>
-          <w:rFonts w:ascii="Calibri" w:hAnsi="Calibri" w:cs="Calibri"/>
-          <w:b/>
-          <w:bCs/>
-          <w:color w:val="1F2937"/>
-          <w:sz w:val="22"/>
-          <w:szCs w:val="22"/>
-        </w:rPr>
-        <w:t>LMS access</w:t>
-      </w:r>
-      <w:r>
-        <w:rPr>
-          <w:rFonts w:ascii="Calibri" w:hAnsi="Calibri" w:cs="Calibri"/>
-          <w:color w:val="1F2937"/>
-          <w:sz w:val="22"/>
-          <w:szCs w:val="22"/>
-        </w:rPr>
-        <w:t xml:space="preserve"> by an admin.</w:t>
-      </w:r>
-    </w:p>
-    <w:p>
-      <w:pPr>
         <w:rPr>
           <w:rFonts w:ascii="Calibri" w:eastAsia="Times New Roman" w:hAnsi="Calibri" w:cs="Calibri"/>
           <w:color w:val="1F2937"/>
@@ -920,7 +840,7 @@
           <w:sz w:val="22"/>
           <w:szCs w:val="22"/>
         </w:rPr>
-        <w:pict w14:anchorId="29FCC585">
+        <w:pict w14:anchorId="5B18BDC1">
           <v:rect id="_x0000_i1027" style="width:0;height:1.5pt" o:hralign="center" o:hrstd="t" o:hr="t" fillcolor="#a0a0a0" stroked="f"/>
         </w:pict>
       </w:r>
@@ -936,7 +856,6 @@
         <w:rPr>
           <w:rFonts w:ascii="Calibri" w:eastAsia="Times New Roman" w:hAnsi="Calibri" w:cs="Calibri"/>
         </w:rPr>
-        <w:lastRenderedPageBreak/>
         <w:t>3. Required functions and current status</w:t>
       </w:r>
     </w:p>
@@ -1010,16 +929,7 @@
           <w:sz w:val="22"/>
           <w:szCs w:val="22"/>
         </w:rPr>
-        <w:t xml:space="preserve"> </w:t>
-      </w:r>
-      <w:r>
-        <w:rPr>
-          <w:rFonts w:ascii="Calibri" w:hAnsi="Calibri" w:cs="Calibri"/>
-          <w:color w:val="1F2937"/>
-          <w:sz w:val="22"/>
-          <w:szCs w:val="22"/>
-        </w:rPr>
-        <w:t xml:space="preserve">Done but waiting on testing or sign-off · </w:t>
+        <w:t xml:space="preserve"> Done but waiting on testing or sign-off · </w:t>
       </w:r>
       <w:r>
         <w:rPr>
@@ -1137,6 +1047,7 @@
                 <w:sz w:val="20"/>
                 <w:szCs w:val="20"/>
               </w:rPr>
+              <w:lastRenderedPageBreak/>
               <w:t>Requirement</w:t>
             </w:r>
           </w:p>
@@ -1465,289 +1376,6 @@
                 <w:szCs w:val="20"/>
               </w:rPr>
               <w:t>Inactive users cannot sign in</w:t>
-            </w:r>
-          </w:p>
-        </w:tc>
-        <w:tc>
-          <w:tcPr>
-            <w:tcW w:w="1516" w:type="pct"/>
-            <w:tcBorders>
-              <w:top w:val="single" w:sz="6" w:space="0" w:color="CBD5E1"/>
-              <w:left w:val="single" w:sz="6" w:space="0" w:color="CBD5E1"/>
-              <w:bottom w:val="single" w:sz="6" w:space="0" w:color="CBD5E1"/>
-              <w:right w:val="single" w:sz="6" w:space="0" w:color="CBD5E1"/>
-            </w:tcBorders>
-            <w:tcMar>
-              <w:top w:w="80" w:type="dxa"/>
-              <w:left w:w="120" w:type="dxa"/>
-              <w:bottom w:w="80" w:type="dxa"/>
-              <w:right w:w="120" w:type="dxa"/>
-            </w:tcMar>
-            <w:hideMark/>
-          </w:tcPr>
-          <w:p>
-            <w:pPr>
-              <w:spacing w:before="120" w:after="200"/>
-              <w:rPr>
-                <w:rFonts w:ascii="Calibri" w:eastAsia="Times New Roman" w:hAnsi="Calibri" w:cs="Calibri"/>
-                <w:color w:val="1F2937"/>
-                <w:sz w:val="20"/>
-                <w:szCs w:val="20"/>
-              </w:rPr>
-            </w:pPr>
-            <w:r>
-              <w:rPr>
-                <w:rFonts w:ascii="Calibri" w:eastAsia="Times New Roman" w:hAnsi="Calibri" w:cs="Calibri"/>
-                <w:b/>
-                <w:bCs/>
-                <w:color w:val="065F46"/>
-                <w:sz w:val="20"/>
-                <w:szCs w:val="20"/>
-                <w:shd w:val="clear" w:color="auto" w:fill="D1FAE5"/>
-              </w:rPr>
-              <w:t>Done</w:t>
-            </w:r>
-          </w:p>
-        </w:tc>
-      </w:tr>
-      <w:tr>
-        <w:tc>
-          <w:tcPr>
-            <w:tcW w:w="3484" w:type="pct"/>
-            <w:tcBorders>
-              <w:top w:val="single" w:sz="6" w:space="0" w:color="CBD5E1"/>
-              <w:left w:val="single" w:sz="6" w:space="0" w:color="CBD5E1"/>
-              <w:bottom w:val="single" w:sz="6" w:space="0" w:color="CBD5E1"/>
-              <w:right w:val="single" w:sz="6" w:space="0" w:color="CBD5E1"/>
-            </w:tcBorders>
-            <w:tcMar>
-              <w:top w:w="80" w:type="dxa"/>
-              <w:left w:w="120" w:type="dxa"/>
-              <w:bottom w:w="80" w:type="dxa"/>
-              <w:right w:w="120" w:type="dxa"/>
-            </w:tcMar>
-            <w:hideMark/>
-          </w:tcPr>
-          <w:p>
-            <w:pPr>
-              <w:spacing w:before="120" w:after="200"/>
-              <w:rPr>
-                <w:rFonts w:ascii="Calibri" w:eastAsia="Times New Roman" w:hAnsi="Calibri" w:cs="Calibri"/>
-                <w:color w:val="1F2937"/>
-                <w:sz w:val="20"/>
-                <w:szCs w:val="20"/>
-              </w:rPr>
-            </w:pPr>
-            <w:r>
-              <w:rPr>
-                <w:rFonts w:ascii="Calibri" w:eastAsia="Times New Roman" w:hAnsi="Calibri" w:cs="Calibri"/>
-                <w:color w:val="1F2937"/>
-                <w:sz w:val="20"/>
-                <w:szCs w:val="20"/>
-              </w:rPr>
-              <w:t xml:space="preserve">Choice of </w:t>
-            </w:r>
-            <w:r>
-              <w:rPr>
-                <w:rFonts w:ascii="Calibri" w:eastAsia="Times New Roman" w:hAnsi="Calibri" w:cs="Calibri"/>
-                <w:b/>
-                <w:bCs/>
-                <w:color w:val="1F2937"/>
-                <w:sz w:val="20"/>
-                <w:szCs w:val="20"/>
-              </w:rPr>
-              <w:t>SMS</w:t>
-            </w:r>
-            <w:r>
-              <w:rPr>
-                <w:rFonts w:ascii="Calibri" w:eastAsia="Times New Roman" w:hAnsi="Calibri" w:cs="Calibri"/>
-                <w:color w:val="1F2937"/>
-                <w:sz w:val="20"/>
-                <w:szCs w:val="20"/>
-              </w:rPr>
-              <w:t xml:space="preserve"> (blue) or </w:t>
-            </w:r>
-            <w:r>
-              <w:rPr>
-                <w:rFonts w:ascii="Calibri" w:eastAsia="Times New Roman" w:hAnsi="Calibri" w:cs="Calibri"/>
-                <w:b/>
-                <w:bCs/>
-                <w:color w:val="1F2937"/>
-                <w:sz w:val="20"/>
-                <w:szCs w:val="20"/>
-              </w:rPr>
-              <w:t>LMS</w:t>
-            </w:r>
-            <w:r>
-              <w:rPr>
-                <w:rFonts w:ascii="Calibri" w:eastAsia="Times New Roman" w:hAnsi="Calibri" w:cs="Calibri"/>
-                <w:color w:val="1F2937"/>
-                <w:sz w:val="20"/>
-                <w:szCs w:val="20"/>
-              </w:rPr>
-              <w:t xml:space="preserve"> (green) on the login page</w:t>
-            </w:r>
-          </w:p>
-        </w:tc>
-        <w:tc>
-          <w:tcPr>
-            <w:tcW w:w="1516" w:type="pct"/>
-            <w:tcBorders>
-              <w:top w:val="single" w:sz="6" w:space="0" w:color="CBD5E1"/>
-              <w:left w:val="single" w:sz="6" w:space="0" w:color="CBD5E1"/>
-              <w:bottom w:val="single" w:sz="6" w:space="0" w:color="CBD5E1"/>
-              <w:right w:val="single" w:sz="6" w:space="0" w:color="CBD5E1"/>
-            </w:tcBorders>
-            <w:tcMar>
-              <w:top w:w="80" w:type="dxa"/>
-              <w:left w:w="120" w:type="dxa"/>
-              <w:bottom w:w="80" w:type="dxa"/>
-              <w:right w:w="120" w:type="dxa"/>
-            </w:tcMar>
-            <w:hideMark/>
-          </w:tcPr>
-          <w:p>
-            <w:pPr>
-              <w:spacing w:before="120" w:after="200"/>
-              <w:rPr>
-                <w:rFonts w:ascii="Calibri" w:eastAsia="Times New Roman" w:hAnsi="Calibri" w:cs="Calibri"/>
-                <w:color w:val="1F2937"/>
-                <w:sz w:val="20"/>
-                <w:szCs w:val="20"/>
-              </w:rPr>
-            </w:pPr>
-            <w:r>
-              <w:rPr>
-                <w:rFonts w:ascii="Calibri" w:eastAsia="Times New Roman" w:hAnsi="Calibri" w:cs="Calibri"/>
-                <w:b/>
-                <w:bCs/>
-                <w:color w:val="065F46"/>
-                <w:sz w:val="20"/>
-                <w:szCs w:val="20"/>
-                <w:shd w:val="clear" w:color="auto" w:fill="D1FAE5"/>
-              </w:rPr>
-              <w:t>Done</w:t>
-            </w:r>
-          </w:p>
-        </w:tc>
-      </w:tr>
-      <w:tr>
-        <w:tc>
-          <w:tcPr>
-            <w:tcW w:w="3484" w:type="pct"/>
-            <w:tcBorders>
-              <w:top w:val="single" w:sz="6" w:space="0" w:color="CBD5E1"/>
-              <w:left w:val="single" w:sz="6" w:space="0" w:color="CBD5E1"/>
-              <w:bottom w:val="single" w:sz="6" w:space="0" w:color="CBD5E1"/>
-              <w:right w:val="single" w:sz="6" w:space="0" w:color="CBD5E1"/>
-            </w:tcBorders>
-            <w:tcMar>
-              <w:top w:w="80" w:type="dxa"/>
-              <w:left w:w="120" w:type="dxa"/>
-              <w:bottom w:w="80" w:type="dxa"/>
-              <w:right w:w="120" w:type="dxa"/>
-            </w:tcMar>
-            <w:hideMark/>
-          </w:tcPr>
-          <w:p>
-            <w:pPr>
-              <w:spacing w:before="120" w:after="200"/>
-              <w:rPr>
-                <w:rFonts w:ascii="Calibri" w:eastAsia="Times New Roman" w:hAnsi="Calibri" w:cs="Calibri"/>
-                <w:color w:val="1F2937"/>
-                <w:sz w:val="20"/>
-                <w:szCs w:val="20"/>
-              </w:rPr>
-            </w:pPr>
-            <w:r>
-              <w:rPr>
-                <w:rFonts w:ascii="Calibri" w:eastAsia="Times New Roman" w:hAnsi="Calibri" w:cs="Calibri"/>
-                <w:color w:val="1F2937"/>
-                <w:sz w:val="20"/>
-                <w:szCs w:val="20"/>
-              </w:rPr>
-              <w:t>Admin decides per user whether they may use LMS</w:t>
-            </w:r>
-          </w:p>
-        </w:tc>
-        <w:tc>
-          <w:tcPr>
-            <w:tcW w:w="1516" w:type="pct"/>
-            <w:tcBorders>
-              <w:top w:val="single" w:sz="6" w:space="0" w:color="CBD5E1"/>
-              <w:left w:val="single" w:sz="6" w:space="0" w:color="CBD5E1"/>
-              <w:bottom w:val="single" w:sz="6" w:space="0" w:color="CBD5E1"/>
-              <w:right w:val="single" w:sz="6" w:space="0" w:color="CBD5E1"/>
-            </w:tcBorders>
-            <w:tcMar>
-              <w:top w:w="80" w:type="dxa"/>
-              <w:left w:w="120" w:type="dxa"/>
-              <w:bottom w:w="80" w:type="dxa"/>
-              <w:right w:w="120" w:type="dxa"/>
-            </w:tcMar>
-            <w:hideMark/>
-          </w:tcPr>
-          <w:p>
-            <w:pPr>
-              <w:spacing w:before="120" w:after="200"/>
-              <w:rPr>
-                <w:rFonts w:ascii="Calibri" w:eastAsia="Times New Roman" w:hAnsi="Calibri" w:cs="Calibri"/>
-                <w:color w:val="1F2937"/>
-                <w:sz w:val="20"/>
-                <w:szCs w:val="20"/>
-              </w:rPr>
-            </w:pPr>
-            <w:r>
-              <w:rPr>
-                <w:rFonts w:ascii="Calibri" w:eastAsia="Times New Roman" w:hAnsi="Calibri" w:cs="Calibri"/>
-                <w:b/>
-                <w:bCs/>
-                <w:color w:val="065F46"/>
-                <w:sz w:val="20"/>
-                <w:szCs w:val="20"/>
-                <w:shd w:val="clear" w:color="auto" w:fill="D1FAE5"/>
-              </w:rPr>
-              <w:t>Done</w:t>
-            </w:r>
-          </w:p>
-        </w:tc>
-      </w:tr>
-      <w:tr>
-        <w:tc>
-          <w:tcPr>
-            <w:tcW w:w="3484" w:type="pct"/>
-            <w:tcBorders>
-              <w:top w:val="single" w:sz="6" w:space="0" w:color="CBD5E1"/>
-              <w:left w:val="single" w:sz="6" w:space="0" w:color="CBD5E1"/>
-              <w:bottom w:val="single" w:sz="6" w:space="0" w:color="CBD5E1"/>
-              <w:right w:val="single" w:sz="6" w:space="0" w:color="CBD5E1"/>
-            </w:tcBorders>
-            <w:tcMar>
-              <w:top w:w="80" w:type="dxa"/>
-              <w:left w:w="120" w:type="dxa"/>
-              <w:bottom w:w="80" w:type="dxa"/>
-              <w:right w:w="120" w:type="dxa"/>
-            </w:tcMar>
-            <w:hideMark/>
-          </w:tcPr>
-          <w:p>
-            <w:pPr>
-              <w:spacing w:before="120" w:after="200"/>
-              <w:rPr>
-                <w:rFonts w:ascii="Calibri" w:eastAsia="Times New Roman" w:hAnsi="Calibri" w:cs="Calibri"/>
-                <w:color w:val="1F2937"/>
-                <w:sz w:val="20"/>
-                <w:szCs w:val="20"/>
-              </w:rPr>
-            </w:pPr>
-            <w:r>
-              <w:rPr>
-                <w:rFonts w:ascii="Calibri" w:eastAsia="Times New Roman" w:hAnsi="Calibri" w:cs="Calibri"/>
-                <w:color w:val="1F2937"/>
-                <w:sz w:val="20"/>
-                <w:szCs w:val="20"/>
-              </w:rPr>
-              <w:t>LMS tab and LMS login hidden from users without access</w:t>
             </w:r>
           </w:p>
         </w:tc>
@@ -2168,87 +1796,6 @@
           </w:p>
         </w:tc>
       </w:tr>
-      <w:tr>
-        <w:tc>
-          <w:tcPr>
-            <w:tcW w:w="4269" w:type="pct"/>
-            <w:tcBorders>
-              <w:top w:val="single" w:sz="6" w:space="0" w:color="CBD5E1"/>
-              <w:left w:val="single" w:sz="6" w:space="0" w:color="CBD5E1"/>
-              <w:bottom w:val="single" w:sz="6" w:space="0" w:color="CBD5E1"/>
-              <w:right w:val="single" w:sz="6" w:space="0" w:color="CBD5E1"/>
-            </w:tcBorders>
-            <w:tcMar>
-              <w:top w:w="80" w:type="dxa"/>
-              <w:left w:w="120" w:type="dxa"/>
-              <w:bottom w:w="80" w:type="dxa"/>
-              <w:right w:w="120" w:type="dxa"/>
-            </w:tcMar>
-            <w:hideMark/>
-          </w:tcPr>
-          <w:p>
-            <w:pPr>
-              <w:spacing w:before="120" w:after="200"/>
-              <w:rPr>
-                <w:rFonts w:ascii="Calibri" w:eastAsia="Times New Roman" w:hAnsi="Calibri" w:cs="Calibri"/>
-                <w:color w:val="1F2937"/>
-                <w:sz w:val="20"/>
-                <w:szCs w:val="20"/>
-              </w:rPr>
-            </w:pPr>
-            <w:r>
-              <w:rPr>
-                <w:rFonts w:ascii="Calibri" w:eastAsia="Times New Roman" w:hAnsi="Calibri" w:cs="Calibri"/>
-                <w:color w:val="1F2937"/>
-                <w:sz w:val="20"/>
-                <w:szCs w:val="20"/>
-              </w:rPr>
-              <w:t>LMS portal card for users with LMS access</w:t>
-            </w:r>
-          </w:p>
-        </w:tc>
-        <w:tc>
-          <w:tcPr>
-            <w:tcW w:w="731" w:type="pct"/>
-            <w:tcBorders>
-              <w:top w:val="single" w:sz="6" w:space="0" w:color="CBD5E1"/>
-              <w:left w:val="single" w:sz="6" w:space="0" w:color="CBD5E1"/>
-              <w:bottom w:val="single" w:sz="6" w:space="0" w:color="CBD5E1"/>
-              <w:right w:val="single" w:sz="6" w:space="0" w:color="CBD5E1"/>
-            </w:tcBorders>
-            <w:tcMar>
-              <w:top w:w="80" w:type="dxa"/>
-              <w:left w:w="120" w:type="dxa"/>
-              <w:bottom w:w="80" w:type="dxa"/>
-              <w:right w:w="120" w:type="dxa"/>
-            </w:tcMar>
-            <w:hideMark/>
-          </w:tcPr>
-          <w:p>
-            <w:pPr>
-              <w:spacing w:before="120" w:after="200"/>
-              <w:rPr>
-                <w:rFonts w:ascii="Calibri" w:eastAsia="Times New Roman" w:hAnsi="Calibri" w:cs="Calibri"/>
-                <w:color w:val="1F2937"/>
-                <w:sz w:val="20"/>
-                <w:szCs w:val="20"/>
-              </w:rPr>
-            </w:pPr>
-            <w:r>
-              <w:rPr>
-                <w:rFonts w:ascii="Calibri" w:eastAsia="Times New Roman" w:hAnsi="Calibri" w:cs="Calibri"/>
-                <w:b/>
-                <w:bCs/>
-                <w:color w:val="065F46"/>
-                <w:sz w:val="20"/>
-                <w:szCs w:val="20"/>
-                <w:shd w:val="clear" w:color="auto" w:fill="D1FAE5"/>
-              </w:rPr>
-              <w:t>Done</w:t>
-            </w:r>
-          </w:p>
-        </w:tc>
-      </w:tr>
     </w:tbl>
     <w:p>
       <w:pPr>
@@ -2323,7 +1870,6 @@
                 <w:sz w:val="20"/>
                 <w:szCs w:val="20"/>
               </w:rPr>
-              <w:lastRenderedPageBreak/>
               <w:t>Requirement</w:t>
             </w:r>
           </w:p>
@@ -2894,6 +2440,7 @@
                 <w:sz w:val="20"/>
                 <w:szCs w:val="20"/>
               </w:rPr>
+              <w:lastRenderedPageBreak/>
               <w:t>Pending Approvals page for approvers</w:t>
             </w:r>
           </w:p>
@@ -3768,7 +3315,6 @@
                 <w:sz w:val="20"/>
                 <w:szCs w:val="20"/>
               </w:rPr>
-              <w:lastRenderedPageBreak/>
               <w:t xml:space="preserve">Record whether each part came from the </w:t>
             </w:r>
             <w:r>
@@ -3881,16 +3427,7 @@
                 <w:sz w:val="20"/>
                 <w:szCs w:val="20"/>
               </w:rPr>
-              <w:t>Part-number rule: C&amp;</w:t>
-            </w:r>
-            <w:r>
-              <w:rPr>
-                <w:rFonts w:ascii="Calibri" w:eastAsia="Times New Roman" w:hAnsi="Calibri" w:cs="Calibri"/>
-                <w:color w:val="1F2937"/>
-                <w:sz w:val="20"/>
-                <w:szCs w:val="20"/>
-              </w:rPr>
-              <w:t>I parts are updated in the Parts Library, other AutoCAD parts in AutoCAD</w:t>
+              <w:t>Part-number rule: C&amp;I parts are updated in the Parts Library, other AutoCAD parts in AutoCAD</w:t>
             </w:r>
           </w:p>
         </w:tc>
@@ -4396,6 +3933,7 @@
                 <w:sz w:val="20"/>
                 <w:szCs w:val="20"/>
               </w:rPr>
+              <w:lastRenderedPageBreak/>
               <w:t>History of uploads and checks, newest first</w:t>
             </w:r>
           </w:p>
@@ -5143,7 +4681,6 @@
                 <w:sz w:val="20"/>
                 <w:szCs w:val="20"/>
               </w:rPr>
-              <w:lastRenderedPageBreak/>
               <w:t>Requirement</w:t>
             </w:r>
           </w:p>
@@ -5552,7 +5089,7 @@
                 <w:sz w:val="20"/>
                 <w:szCs w:val="20"/>
               </w:rPr>
-              <w:t>User management: add, edit, deactivate, delete; role and LMS access</w:t>
+              <w:t>User management: add, edit, deactivate, delete; set role</w:t>
             </w:r>
           </w:p>
         </w:tc>
@@ -5753,6 +5290,7 @@
                 <w:sz w:val="20"/>
                 <w:szCs w:val="20"/>
               </w:rPr>
+              <w:lastRenderedPageBreak/>
               <w:t>Requirement</w:t>
             </w:r>
           </w:p>
@@ -6219,7 +5757,7 @@
         <w:rPr>
           <w:rFonts w:ascii="Calibri" w:eastAsia="Times New Roman" w:hAnsi="Calibri" w:cs="Calibri"/>
         </w:rPr>
-        <w:t>3.8 LMS Scope of Work (linked to ManageIT)</w:t>
+        <w:t>3.8 Data, hosting and maintenance</w:t>
       </w:r>
     </w:p>
     <w:tbl>
@@ -6234,8 +5772,8 @@
         <w:tblLook w:val="04A0" w:firstRow="1" w:lastRow="0" w:firstColumn="1" w:lastColumn="0" w:noHBand="0" w:noVBand="1"/>
       </w:tblPr>
       <w:tblGrid>
-        <w:gridCol w:w="6110"/>
-        <w:gridCol w:w="3620"/>
+        <w:gridCol w:w="6548"/>
+        <w:gridCol w:w="3182"/>
       </w:tblGrid>
       <w:tr>
         <w:trPr>
@@ -6243,7 +5781,7 @@
         </w:trPr>
         <w:tc>
           <w:tcPr>
-            <w:tcW w:w="3140" w:type="pct"/>
+            <w:tcW w:w="3365" w:type="pct"/>
             <w:tcBorders>
               <w:top w:val="single" w:sz="6" w:space="0" w:color="0F2A4A"/>
               <w:left w:val="single" w:sz="6" w:space="0" w:color="0F2A4A"/>
@@ -6287,7 +5825,7 @@
         </w:tc>
         <w:tc>
           <w:tcPr>
-            <w:tcW w:w="1860" w:type="pct"/>
+            <w:tcW w:w="1635" w:type="pct"/>
             <w:tcBorders>
               <w:top w:val="single" w:sz="6" w:space="0" w:color="0F2A4A"/>
               <w:left w:val="single" w:sz="6" w:space="0" w:color="0F2A4A"/>
@@ -6333,45 +5871,45 @@
       <w:tr>
         <w:tc>
           <w:tcPr>
-            <w:tcW w:w="3140" w:type="pct"/>
-            <w:tcBorders>
-              <w:top w:val="single" w:sz="6" w:space="0" w:color="CBD5E1"/>
-              <w:left w:val="single" w:sz="6" w:space="0" w:color="CBD5E1"/>
-              <w:bottom w:val="single" w:sz="6" w:space="0" w:color="CBD5E1"/>
-              <w:right w:val="single" w:sz="6" w:space="0" w:color="CBD5E1"/>
-            </w:tcBorders>
-            <w:tcMar>
-              <w:top w:w="80" w:type="dxa"/>
-              <w:left w:w="120" w:type="dxa"/>
-              <w:bottom w:w="80" w:type="dxa"/>
-              <w:right w:w="120" w:type="dxa"/>
-            </w:tcMar>
-            <w:hideMark/>
-          </w:tcPr>
-          <w:p>
-            <w:pPr>
-              <w:spacing w:before="120" w:after="200"/>
-              <w:rPr>
-                <w:rFonts w:ascii="Calibri" w:eastAsia="Times New Roman" w:hAnsi="Calibri" w:cs="Calibri"/>
-                <w:color w:val="1F2937"/>
-                <w:sz w:val="20"/>
-                <w:szCs w:val="20"/>
-              </w:rPr>
-            </w:pPr>
-            <w:r>
-              <w:rPr>
-                <w:rFonts w:ascii="Calibri" w:eastAsia="Times New Roman" w:hAnsi="Calibri" w:cs="Calibri"/>
-                <w:color w:val="1F2937"/>
-                <w:sz w:val="20"/>
-                <w:szCs w:val="20"/>
-              </w:rPr>
-              <w:t>LMS app inside the ManageIT folder and reachable from ManageIT</w:t>
-            </w:r>
-          </w:p>
-        </w:tc>
-        <w:tc>
-          <w:tcPr>
-            <w:tcW w:w="1860" w:type="pct"/>
+            <w:tcW w:w="3365" w:type="pct"/>
+            <w:tcBorders>
+              <w:top w:val="single" w:sz="6" w:space="0" w:color="CBD5E1"/>
+              <w:left w:val="single" w:sz="6" w:space="0" w:color="CBD5E1"/>
+              <w:bottom w:val="single" w:sz="6" w:space="0" w:color="CBD5E1"/>
+              <w:right w:val="single" w:sz="6" w:space="0" w:color="CBD5E1"/>
+            </w:tcBorders>
+            <w:tcMar>
+              <w:top w:w="80" w:type="dxa"/>
+              <w:left w:w="120" w:type="dxa"/>
+              <w:bottom w:w="80" w:type="dxa"/>
+              <w:right w:w="120" w:type="dxa"/>
+            </w:tcMar>
+            <w:hideMark/>
+          </w:tcPr>
+          <w:p>
+            <w:pPr>
+              <w:spacing w:before="120" w:after="200"/>
+              <w:rPr>
+                <w:rFonts w:ascii="Calibri" w:eastAsia="Times New Roman" w:hAnsi="Calibri" w:cs="Calibri"/>
+                <w:color w:val="1F2937"/>
+                <w:sz w:val="20"/>
+                <w:szCs w:val="20"/>
+              </w:rPr>
+            </w:pPr>
+            <w:r>
+              <w:rPr>
+                <w:rFonts w:ascii="Calibri" w:eastAsia="Times New Roman" w:hAnsi="Calibri" w:cs="Calibri"/>
+                <w:color w:val="1F2937"/>
+                <w:sz w:val="20"/>
+                <w:szCs w:val="20"/>
+              </w:rPr>
+              <w:t>SQL Server database design and setup scripts</w:t>
+            </w:r>
+          </w:p>
+        </w:tc>
+        <w:tc>
+          <w:tcPr>
+            <w:tcW w:w="1635" w:type="pct"/>
             <w:tcBorders>
               <w:top w:val="single" w:sz="6" w:space="0" w:color="CBD5E1"/>
               <w:left w:val="single" w:sz="6" w:space="0" w:color="CBD5E1"/>
@@ -6414,45 +5952,45 @@
       <w:tr>
         <w:tc>
           <w:tcPr>
-            <w:tcW w:w="3140" w:type="pct"/>
-            <w:tcBorders>
-              <w:top w:val="single" w:sz="6" w:space="0" w:color="CBD5E1"/>
-              <w:left w:val="single" w:sz="6" w:space="0" w:color="CBD5E1"/>
-              <w:bottom w:val="single" w:sz="6" w:space="0" w:color="CBD5E1"/>
-              <w:right w:val="single" w:sz="6" w:space="0" w:color="CBD5E1"/>
-            </w:tcBorders>
-            <w:tcMar>
-              <w:top w:w="80" w:type="dxa"/>
-              <w:left w:w="120" w:type="dxa"/>
-              <w:bottom w:w="80" w:type="dxa"/>
-              <w:right w:w="120" w:type="dxa"/>
-            </w:tcMar>
-            <w:hideMark/>
-          </w:tcPr>
-          <w:p>
-            <w:pPr>
-              <w:spacing w:before="120" w:after="200"/>
-              <w:rPr>
-                <w:rFonts w:ascii="Calibri" w:eastAsia="Times New Roman" w:hAnsi="Calibri" w:cs="Calibri"/>
-                <w:color w:val="1F2937"/>
-                <w:sz w:val="20"/>
-                <w:szCs w:val="20"/>
-              </w:rPr>
-            </w:pPr>
-            <w:r>
-              <w:rPr>
-                <w:rFonts w:ascii="Calibri" w:eastAsia="Times New Roman" w:hAnsi="Calibri" w:cs="Calibri"/>
-                <w:color w:val="1F2937"/>
-                <w:sz w:val="20"/>
-                <w:szCs w:val="20"/>
-              </w:rPr>
-              <w:t>Same login as SMS, plus the per-user access control above</w:t>
-            </w:r>
-          </w:p>
-        </w:tc>
-        <w:tc>
-          <w:tcPr>
-            <w:tcW w:w="1860" w:type="pct"/>
+            <w:tcW w:w="3365" w:type="pct"/>
+            <w:tcBorders>
+              <w:top w:val="single" w:sz="6" w:space="0" w:color="CBD5E1"/>
+              <w:left w:val="single" w:sz="6" w:space="0" w:color="CBD5E1"/>
+              <w:bottom w:val="single" w:sz="6" w:space="0" w:color="CBD5E1"/>
+              <w:right w:val="single" w:sz="6" w:space="0" w:color="CBD5E1"/>
+            </w:tcBorders>
+            <w:tcMar>
+              <w:top w:w="80" w:type="dxa"/>
+              <w:left w:w="120" w:type="dxa"/>
+              <w:bottom w:w="80" w:type="dxa"/>
+              <w:right w:w="120" w:type="dxa"/>
+            </w:tcMar>
+            <w:hideMark/>
+          </w:tcPr>
+          <w:p>
+            <w:pPr>
+              <w:spacing w:before="120" w:after="200"/>
+              <w:rPr>
+                <w:rFonts w:ascii="Calibri" w:eastAsia="Times New Roman" w:hAnsi="Calibri" w:cs="Calibri"/>
+                <w:color w:val="1F2937"/>
+                <w:sz w:val="20"/>
+                <w:szCs w:val="20"/>
+              </w:rPr>
+            </w:pPr>
+            <w:r>
+              <w:rPr>
+                <w:rFonts w:ascii="Calibri" w:eastAsia="Times New Roman" w:hAnsi="Calibri" w:cs="Calibri"/>
+                <w:color w:val="1F2937"/>
+                <w:sz w:val="20"/>
+                <w:szCs w:val="20"/>
+              </w:rPr>
+              <w:t>New database script for BOM and Pastel data</w:t>
+            </w:r>
+          </w:p>
+        </w:tc>
+        <w:tc>
+          <w:tcPr>
+            <w:tcW w:w="1635" w:type="pct"/>
             <w:tcBorders>
               <w:top w:val="single" w:sz="6" w:space="0" w:color="CBD5E1"/>
               <w:left w:val="single" w:sz="6" w:space="0" w:color="CBD5E1"/>
@@ -6488,6 +6026,15 @@
                 <w:shd w:val="clear" w:color="auto" w:fill="D1FAE5"/>
               </w:rPr>
               <w:t>Done</w:t>
+            </w:r>
+            <w:r>
+              <w:rPr>
+                <w:rFonts w:ascii="Calibri" w:eastAsia="Times New Roman" w:hAnsi="Calibri" w:cs="Calibri"/>
+                <w:color w:val="1F2937"/>
+                <w:sz w:val="20"/>
+                <w:szCs w:val="20"/>
+              </w:rPr>
+              <w:t xml:space="preserve"> Written, not yet run</w:t>
             </w:r>
           </w:p>
         </w:tc>
@@ -6495,57 +6042,45 @@
       <w:tr>
         <w:tc>
           <w:tcPr>
-            <w:tcW w:w="3140" w:type="pct"/>
-            <w:tcBorders>
-              <w:top w:val="single" w:sz="6" w:space="0" w:color="CBD5E1"/>
-              <w:left w:val="single" w:sz="6" w:space="0" w:color="CBD5E1"/>
-              <w:bottom w:val="single" w:sz="6" w:space="0" w:color="CBD5E1"/>
-              <w:right w:val="single" w:sz="6" w:space="0" w:color="CBD5E1"/>
-            </w:tcBorders>
-            <w:tcMar>
-              <w:top w:w="80" w:type="dxa"/>
-              <w:left w:w="120" w:type="dxa"/>
-              <w:bottom w:w="80" w:type="dxa"/>
-              <w:right w:w="120" w:type="dxa"/>
-            </w:tcMar>
-            <w:hideMark/>
-          </w:tcPr>
-          <w:p>
-            <w:pPr>
-              <w:spacing w:before="120" w:after="200"/>
-              <w:rPr>
-                <w:rFonts w:ascii="Calibri" w:eastAsia="Times New Roman" w:hAnsi="Calibri" w:cs="Calibri"/>
-                <w:color w:val="1F2937"/>
-                <w:sz w:val="20"/>
-                <w:szCs w:val="20"/>
-              </w:rPr>
-            </w:pPr>
-            <w:r>
-              <w:rPr>
-                <w:rFonts w:ascii="Calibri" w:eastAsia="Times New Roman" w:hAnsi="Calibri" w:cs="Calibri"/>
-                <w:b/>
-                <w:bCs/>
-                <w:color w:val="1F2937"/>
-                <w:sz w:val="20"/>
-                <w:szCs w:val="20"/>
-              </w:rPr>
-              <w:lastRenderedPageBreak/>
-              <w:t>Asset Lifecycle:</w:t>
-            </w:r>
-            <w:r>
-              <w:rPr>
-                <w:rFonts w:ascii="Calibri" w:eastAsia="Times New Roman" w:hAnsi="Calibri" w:cs="Calibri"/>
-                <w:color w:val="1F2937"/>
-                <w:sz w:val="20"/>
-                <w:szCs w:val="20"/>
-              </w:rPr>
-              <w:t xml:space="preserve"> list of standard equipment types</w:t>
-            </w:r>
-          </w:p>
-        </w:tc>
-        <w:tc>
-          <w:tcPr>
-            <w:tcW w:w="1860" w:type="pct"/>
+            <w:tcW w:w="3365" w:type="pct"/>
+            <w:tcBorders>
+              <w:top w:val="single" w:sz="6" w:space="0" w:color="CBD5E1"/>
+              <w:left w:val="single" w:sz="6" w:space="0" w:color="CBD5E1"/>
+              <w:bottom w:val="single" w:sz="6" w:space="0" w:color="CBD5E1"/>
+              <w:right w:val="single" w:sz="6" w:space="0" w:color="CBD5E1"/>
+            </w:tcBorders>
+            <w:tcMar>
+              <w:top w:w="80" w:type="dxa"/>
+              <w:left w:w="120" w:type="dxa"/>
+              <w:bottom w:w="80" w:type="dxa"/>
+              <w:right w:w="120" w:type="dxa"/>
+            </w:tcMar>
+            <w:hideMark/>
+          </w:tcPr>
+          <w:p>
+            <w:pPr>
+              <w:spacing w:before="120" w:after="200"/>
+              <w:rPr>
+                <w:rFonts w:ascii="Calibri" w:eastAsia="Times New Roman" w:hAnsi="Calibri" w:cs="Calibri"/>
+                <w:color w:val="1F2937"/>
+                <w:sz w:val="20"/>
+                <w:szCs w:val="20"/>
+              </w:rPr>
+            </w:pPr>
+            <w:r>
+              <w:rPr>
+                <w:rFonts w:ascii="Calibri" w:eastAsia="Times New Roman" w:hAnsi="Calibri" w:cs="Calibri"/>
+                <w:color w:val="1F2937"/>
+                <w:sz w:val="20"/>
+                <w:szCs w:val="20"/>
+              </w:rPr>
+              <w:t>Offline mode, so the app still works when the database can't be reached</w:t>
+            </w:r>
+          </w:p>
+        </w:tc>
+        <w:tc>
+          <w:tcPr>
+            <w:tcW w:w="1635" w:type="pct"/>
             <w:tcBorders>
               <w:top w:val="single" w:sz="6" w:space="0" w:color="CBD5E1"/>
               <w:left w:val="single" w:sz="6" w:space="0" w:color="CBD5E1"/>
@@ -6588,80 +6123,89 @@
       <w:tr>
         <w:tc>
           <w:tcPr>
-            <w:tcW w:w="3140" w:type="pct"/>
-            <w:tcBorders>
-              <w:top w:val="single" w:sz="6" w:space="0" w:color="CBD5E1"/>
-              <w:left w:val="single" w:sz="6" w:space="0" w:color="CBD5E1"/>
-              <w:bottom w:val="single" w:sz="6" w:space="0" w:color="CBD5E1"/>
-              <w:right w:val="single" w:sz="6" w:space="0" w:color="CBD5E1"/>
-            </w:tcBorders>
-            <w:tcMar>
-              <w:top w:w="80" w:type="dxa"/>
-              <w:left w:w="120" w:type="dxa"/>
-              <w:bottom w:w="80" w:type="dxa"/>
-              <w:right w:w="120" w:type="dxa"/>
-            </w:tcMar>
-            <w:hideMark/>
-          </w:tcPr>
-          <w:p>
-            <w:pPr>
-              <w:spacing w:before="120" w:after="200"/>
-              <w:rPr>
-                <w:rFonts w:ascii="Calibri" w:eastAsia="Times New Roman" w:hAnsi="Calibri" w:cs="Calibri"/>
-                <w:color w:val="1F2937"/>
-                <w:sz w:val="20"/>
-                <w:szCs w:val="20"/>
-              </w:rPr>
-            </w:pPr>
-            <w:r>
-              <w:rPr>
-                <w:rFonts w:ascii="Calibri" w:eastAsia="Times New Roman" w:hAnsi="Calibri" w:cs="Calibri"/>
-                <w:color w:val="1F2937"/>
-                <w:sz w:val="20"/>
-                <w:szCs w:val="20"/>
-              </w:rPr>
-              <w:t>Asset Lifecycle: each type's BOM, with CSV import</w:t>
-            </w:r>
-          </w:p>
-        </w:tc>
-        <w:tc>
-          <w:tcPr>
-            <w:tcW w:w="1860" w:type="pct"/>
-            <w:tcBorders>
-              <w:top w:val="single" w:sz="6" w:space="0" w:color="CBD5E1"/>
-              <w:left w:val="single" w:sz="6" w:space="0" w:color="CBD5E1"/>
-              <w:bottom w:val="single" w:sz="6" w:space="0" w:color="CBD5E1"/>
-              <w:right w:val="single" w:sz="6" w:space="0" w:color="CBD5E1"/>
-            </w:tcBorders>
-            <w:tcMar>
-              <w:top w:w="80" w:type="dxa"/>
-              <w:left w:w="120" w:type="dxa"/>
-              <w:bottom w:w="80" w:type="dxa"/>
-              <w:right w:w="120" w:type="dxa"/>
-            </w:tcMar>
-            <w:hideMark/>
-          </w:tcPr>
-          <w:p>
-            <w:pPr>
-              <w:spacing w:before="120" w:after="200"/>
-              <w:rPr>
-                <w:rFonts w:ascii="Calibri" w:eastAsia="Times New Roman" w:hAnsi="Calibri" w:cs="Calibri"/>
-                <w:color w:val="1F2937"/>
-                <w:sz w:val="20"/>
-                <w:szCs w:val="20"/>
-              </w:rPr>
-            </w:pPr>
-            <w:r>
-              <w:rPr>
-                <w:rFonts w:ascii="Calibri" w:eastAsia="Times New Roman" w:hAnsi="Calibri" w:cs="Calibri"/>
-                <w:b/>
-                <w:bCs/>
-                <w:color w:val="065F46"/>
-                <w:sz w:val="20"/>
-                <w:szCs w:val="20"/>
-                <w:shd w:val="clear" w:color="auto" w:fill="D1FAE5"/>
-              </w:rPr>
-              <w:t>Done</w:t>
+            <w:tcW w:w="3365" w:type="pct"/>
+            <w:tcBorders>
+              <w:top w:val="single" w:sz="6" w:space="0" w:color="CBD5E1"/>
+              <w:left w:val="single" w:sz="6" w:space="0" w:color="CBD5E1"/>
+              <w:bottom w:val="single" w:sz="6" w:space="0" w:color="CBD5E1"/>
+              <w:right w:val="single" w:sz="6" w:space="0" w:color="CBD5E1"/>
+            </w:tcBorders>
+            <w:tcMar>
+              <w:top w:w="80" w:type="dxa"/>
+              <w:left w:w="120" w:type="dxa"/>
+              <w:bottom w:w="80" w:type="dxa"/>
+              <w:right w:w="120" w:type="dxa"/>
+            </w:tcMar>
+            <w:hideMark/>
+          </w:tcPr>
+          <w:p>
+            <w:pPr>
+              <w:spacing w:before="120" w:after="200"/>
+              <w:rPr>
+                <w:rFonts w:ascii="Calibri" w:eastAsia="Times New Roman" w:hAnsi="Calibri" w:cs="Calibri"/>
+                <w:color w:val="1F2937"/>
+                <w:sz w:val="20"/>
+                <w:szCs w:val="20"/>
+              </w:rPr>
+            </w:pPr>
+            <w:r>
+              <w:rPr>
+                <w:rFonts w:ascii="Calibri" w:eastAsia="Times New Roman" w:hAnsi="Calibri" w:cs="Calibri"/>
+                <w:color w:val="1F2937"/>
+                <w:sz w:val="20"/>
+                <w:szCs w:val="20"/>
+              </w:rPr>
+              <w:t>Live SQL Server database connected</w:t>
+            </w:r>
+          </w:p>
+        </w:tc>
+        <w:tc>
+          <w:tcPr>
+            <w:tcW w:w="1635" w:type="pct"/>
+            <w:tcBorders>
+              <w:top w:val="single" w:sz="6" w:space="0" w:color="CBD5E1"/>
+              <w:left w:val="single" w:sz="6" w:space="0" w:color="CBD5E1"/>
+              <w:bottom w:val="single" w:sz="6" w:space="0" w:color="CBD5E1"/>
+              <w:right w:val="single" w:sz="6" w:space="0" w:color="CBD5E1"/>
+            </w:tcBorders>
+            <w:tcMar>
+              <w:top w:w="80" w:type="dxa"/>
+              <w:left w:w="120" w:type="dxa"/>
+              <w:bottom w:w="80" w:type="dxa"/>
+              <w:right w:w="120" w:type="dxa"/>
+            </w:tcMar>
+            <w:hideMark/>
+          </w:tcPr>
+          <w:p>
+            <w:pPr>
+              <w:spacing w:before="120" w:after="200"/>
+              <w:rPr>
+                <w:rFonts w:ascii="Calibri" w:eastAsia="Times New Roman" w:hAnsi="Calibri" w:cs="Calibri"/>
+                <w:color w:val="1F2937"/>
+                <w:sz w:val="20"/>
+                <w:szCs w:val="20"/>
+              </w:rPr>
+            </w:pPr>
+            <w:r>
+              <w:rPr>
+                <w:rFonts w:ascii="Calibri" w:eastAsia="Times New Roman" w:hAnsi="Calibri" w:cs="Calibri"/>
+                <w:b/>
+                <w:bCs/>
+                <w:color w:val="374151"/>
+                <w:sz w:val="20"/>
+                <w:szCs w:val="20"/>
+                <w:shd w:val="clear" w:color="auto" w:fill="E5E7EB"/>
+              </w:rPr>
+              <w:t>Not started</w:t>
+            </w:r>
+            <w:r>
+              <w:rPr>
+                <w:rFonts w:ascii="Calibri" w:eastAsia="Times New Roman" w:hAnsi="Calibri" w:cs="Calibri"/>
+                <w:color w:val="1F2937"/>
+                <w:sz w:val="20"/>
+                <w:szCs w:val="20"/>
+              </w:rPr>
+              <w:t xml:space="preserve"> Decision pending</w:t>
             </w:r>
           </w:p>
         </w:tc>
@@ -6669,45 +6213,45 @@
       <w:tr>
         <w:tc>
           <w:tcPr>
-            <w:tcW w:w="3140" w:type="pct"/>
-            <w:tcBorders>
-              <w:top w:val="single" w:sz="6" w:space="0" w:color="CBD5E1"/>
-              <w:left w:val="single" w:sz="6" w:space="0" w:color="CBD5E1"/>
-              <w:bottom w:val="single" w:sz="6" w:space="0" w:color="CBD5E1"/>
-              <w:right w:val="single" w:sz="6" w:space="0" w:color="CBD5E1"/>
-            </w:tcBorders>
-            <w:tcMar>
-              <w:top w:w="80" w:type="dxa"/>
-              <w:left w:w="120" w:type="dxa"/>
-              <w:bottom w:w="80" w:type="dxa"/>
-              <w:right w:w="120" w:type="dxa"/>
-            </w:tcMar>
-            <w:hideMark/>
-          </w:tcPr>
-          <w:p>
-            <w:pPr>
-              <w:spacing w:before="120" w:after="200"/>
-              <w:rPr>
-                <w:rFonts w:ascii="Calibri" w:eastAsia="Times New Roman" w:hAnsi="Calibri" w:cs="Calibri"/>
-                <w:color w:val="1F2937"/>
-                <w:sz w:val="20"/>
-                <w:szCs w:val="20"/>
-              </w:rPr>
-            </w:pPr>
-            <w:r>
-              <w:rPr>
-                <w:rFonts w:ascii="Calibri" w:eastAsia="Times New Roman" w:hAnsi="Calibri" w:cs="Calibri"/>
-                <w:color w:val="1F2937"/>
-                <w:sz w:val="20"/>
-                <w:szCs w:val="20"/>
-              </w:rPr>
-              <w:t>Asset Lifecycle: each type's lifecycle (expected life, warranty, service interval, stages)</w:t>
-            </w:r>
-          </w:p>
-        </w:tc>
-        <w:tc>
-          <w:tcPr>
-            <w:tcW w:w="1860" w:type="pct"/>
+            <w:tcW w:w="3365" w:type="pct"/>
+            <w:tcBorders>
+              <w:top w:val="single" w:sz="6" w:space="0" w:color="CBD5E1"/>
+              <w:left w:val="single" w:sz="6" w:space="0" w:color="CBD5E1"/>
+              <w:bottom w:val="single" w:sz="6" w:space="0" w:color="CBD5E1"/>
+              <w:right w:val="single" w:sz="6" w:space="0" w:color="CBD5E1"/>
+            </w:tcBorders>
+            <w:tcMar>
+              <w:top w:w="80" w:type="dxa"/>
+              <w:left w:w="120" w:type="dxa"/>
+              <w:bottom w:w="80" w:type="dxa"/>
+              <w:right w:w="120" w:type="dxa"/>
+            </w:tcMar>
+            <w:hideMark/>
+          </w:tcPr>
+          <w:p>
+            <w:pPr>
+              <w:spacing w:before="120" w:after="200"/>
+              <w:rPr>
+                <w:rFonts w:ascii="Calibri" w:eastAsia="Times New Roman" w:hAnsi="Calibri" w:cs="Calibri"/>
+                <w:color w:val="1F2937"/>
+                <w:sz w:val="20"/>
+                <w:szCs w:val="20"/>
+              </w:rPr>
+            </w:pPr>
+            <w:r>
+              <w:rPr>
+                <w:rFonts w:ascii="Calibri" w:eastAsia="Times New Roman" w:hAnsi="Calibri" w:cs="Calibri"/>
+                <w:color w:val="1F2937"/>
+                <w:sz w:val="20"/>
+                <w:szCs w:val="20"/>
+              </w:rPr>
+              <w:t>Online demo link (Railway)</w:t>
+            </w:r>
+          </w:p>
+        </w:tc>
+        <w:tc>
+          <w:tcPr>
+            <w:tcW w:w="1635" w:type="pct"/>
             <w:tcBorders>
               <w:top w:val="single" w:sz="6" w:space="0" w:color="CBD5E1"/>
               <w:left w:val="single" w:sz="6" w:space="0" w:color="CBD5E1"/>
@@ -6743,6 +6287,15 @@
                 <w:shd w:val="clear" w:color="auto" w:fill="D1FAE5"/>
               </w:rPr>
               <w:t>Done</w:t>
+            </w:r>
+            <w:r>
+              <w:rPr>
+                <w:rFonts w:ascii="Calibri" w:eastAsia="Times New Roman" w:hAnsi="Calibri" w:cs="Calibri"/>
+                <w:color w:val="1F2937"/>
+                <w:sz w:val="20"/>
+                <w:szCs w:val="20"/>
+              </w:rPr>
+              <w:t xml:space="preserve"> Demo only</w:t>
             </w:r>
           </w:p>
         </w:tc>
@@ -6750,45 +6303,45 @@
       <w:tr>
         <w:tc>
           <w:tcPr>
-            <w:tcW w:w="3140" w:type="pct"/>
-            <w:tcBorders>
-              <w:top w:val="single" w:sz="6" w:space="0" w:color="CBD5E1"/>
-              <w:left w:val="single" w:sz="6" w:space="0" w:color="CBD5E1"/>
-              <w:bottom w:val="single" w:sz="6" w:space="0" w:color="CBD5E1"/>
-              <w:right w:val="single" w:sz="6" w:space="0" w:color="CBD5E1"/>
-            </w:tcBorders>
-            <w:tcMar>
-              <w:top w:w="80" w:type="dxa"/>
-              <w:left w:w="120" w:type="dxa"/>
-              <w:bottom w:w="80" w:type="dxa"/>
-              <w:right w:w="120" w:type="dxa"/>
-            </w:tcMar>
-            <w:hideMark/>
-          </w:tcPr>
-          <w:p>
-            <w:pPr>
-              <w:spacing w:before="120" w:after="200"/>
-              <w:rPr>
-                <w:rFonts w:ascii="Calibri" w:eastAsia="Times New Roman" w:hAnsi="Calibri" w:cs="Calibri"/>
-                <w:color w:val="1F2937"/>
-                <w:sz w:val="20"/>
-                <w:szCs w:val="20"/>
-              </w:rPr>
-            </w:pPr>
-            <w:r>
-              <w:rPr>
-                <w:rFonts w:ascii="Calibri" w:eastAsia="Times New Roman" w:hAnsi="Calibri" w:cs="Calibri"/>
-                <w:color w:val="1F2937"/>
-                <w:sz w:val="20"/>
-                <w:szCs w:val="20"/>
-              </w:rPr>
-              <w:t>Asset Lifecycle: equipment groups, allocated to sites with history</w:t>
-            </w:r>
-          </w:p>
-        </w:tc>
-        <w:tc>
-          <w:tcPr>
-            <w:tcW w:w="1860" w:type="pct"/>
+            <w:tcW w:w="3365" w:type="pct"/>
+            <w:tcBorders>
+              <w:top w:val="single" w:sz="6" w:space="0" w:color="CBD5E1"/>
+              <w:left w:val="single" w:sz="6" w:space="0" w:color="CBD5E1"/>
+              <w:bottom w:val="single" w:sz="6" w:space="0" w:color="CBD5E1"/>
+              <w:right w:val="single" w:sz="6" w:space="0" w:color="CBD5E1"/>
+            </w:tcBorders>
+            <w:tcMar>
+              <w:top w:w="80" w:type="dxa"/>
+              <w:left w:w="120" w:type="dxa"/>
+              <w:bottom w:w="80" w:type="dxa"/>
+              <w:right w:w="120" w:type="dxa"/>
+            </w:tcMar>
+            <w:hideMark/>
+          </w:tcPr>
+          <w:p>
+            <w:pPr>
+              <w:spacing w:before="120" w:after="200"/>
+              <w:rPr>
+                <w:rFonts w:ascii="Calibri" w:eastAsia="Times New Roman" w:hAnsi="Calibri" w:cs="Calibri"/>
+                <w:color w:val="1F2937"/>
+                <w:sz w:val="20"/>
+                <w:szCs w:val="20"/>
+              </w:rPr>
+            </w:pPr>
+            <w:r>
+              <w:rPr>
+                <w:rFonts w:ascii="Calibri" w:eastAsia="Times New Roman" w:hAnsi="Calibri" w:cs="Calibri"/>
+                <w:color w:val="1F2937"/>
+                <w:sz w:val="20"/>
+                <w:szCs w:val="20"/>
+              </w:rPr>
+              <w:t>Code backed up in a private GitHub repository</w:t>
+            </w:r>
+          </w:p>
+        </w:tc>
+        <w:tc>
+          <w:tcPr>
+            <w:tcW w:w="1635" w:type="pct"/>
             <w:tcBorders>
               <w:top w:val="single" w:sz="6" w:space="0" w:color="CBD5E1"/>
               <w:left w:val="single" w:sz="6" w:space="0" w:color="CBD5E1"/>
@@ -6831,80 +6384,98 @@
       <w:tr>
         <w:tc>
           <w:tcPr>
-            <w:tcW w:w="3140" w:type="pct"/>
-            <w:tcBorders>
-              <w:top w:val="single" w:sz="6" w:space="0" w:color="CBD5E1"/>
-              <w:left w:val="single" w:sz="6" w:space="0" w:color="CBD5E1"/>
-              <w:bottom w:val="single" w:sz="6" w:space="0" w:color="CBD5E1"/>
-              <w:right w:val="single" w:sz="6" w:space="0" w:color="CBD5E1"/>
-            </w:tcBorders>
-            <w:tcMar>
-              <w:top w:w="80" w:type="dxa"/>
-              <w:left w:w="120" w:type="dxa"/>
-              <w:bottom w:w="80" w:type="dxa"/>
-              <w:right w:w="120" w:type="dxa"/>
-            </w:tcMar>
-            <w:hideMark/>
-          </w:tcPr>
-          <w:p>
-            <w:pPr>
-              <w:spacing w:before="120" w:after="200"/>
-              <w:rPr>
-                <w:rFonts w:ascii="Calibri" w:eastAsia="Times New Roman" w:hAnsi="Calibri" w:cs="Calibri"/>
-                <w:color w:val="1F2937"/>
-                <w:sz w:val="20"/>
-                <w:szCs w:val="20"/>
-              </w:rPr>
-            </w:pPr>
-            <w:r>
-              <w:rPr>
-                <w:rFonts w:ascii="Calibri" w:eastAsia="Times New Roman" w:hAnsi="Calibri" w:cs="Calibri"/>
-                <w:color w:val="1F2937"/>
-                <w:sz w:val="20"/>
-                <w:szCs w:val="20"/>
-              </w:rPr>
-              <w:t>LMS desktop installer updated to version 1.0.3 with Asset Lifecycle</w:t>
-            </w:r>
-          </w:p>
-        </w:tc>
-        <w:tc>
-          <w:tcPr>
-            <w:tcW w:w="1860" w:type="pct"/>
-            <w:tcBorders>
-              <w:top w:val="single" w:sz="6" w:space="0" w:color="CBD5E1"/>
-              <w:left w:val="single" w:sz="6" w:space="0" w:color="CBD5E1"/>
-              <w:bottom w:val="single" w:sz="6" w:space="0" w:color="CBD5E1"/>
-              <w:right w:val="single" w:sz="6" w:space="0" w:color="CBD5E1"/>
-            </w:tcBorders>
-            <w:tcMar>
-              <w:top w:w="80" w:type="dxa"/>
-              <w:left w:w="120" w:type="dxa"/>
-              <w:bottom w:w="80" w:type="dxa"/>
-              <w:right w:w="120" w:type="dxa"/>
-            </w:tcMar>
-            <w:hideMark/>
-          </w:tcPr>
-          <w:p>
-            <w:pPr>
-              <w:spacing w:before="120" w:after="200"/>
-              <w:rPr>
-                <w:rFonts w:ascii="Calibri" w:eastAsia="Times New Roman" w:hAnsi="Calibri" w:cs="Calibri"/>
-                <w:color w:val="1F2937"/>
-                <w:sz w:val="20"/>
-                <w:szCs w:val="20"/>
-              </w:rPr>
-            </w:pPr>
-            <w:r>
-              <w:rPr>
-                <w:rFonts w:ascii="Calibri" w:eastAsia="Times New Roman" w:hAnsi="Calibri" w:cs="Calibri"/>
-                <w:b/>
-                <w:bCs/>
-                <w:color w:val="065F46"/>
-                <w:sz w:val="20"/>
-                <w:szCs w:val="20"/>
-                <w:shd w:val="clear" w:color="auto" w:fill="D1FAE5"/>
-              </w:rPr>
-              <w:t>Done</w:t>
+            <w:tcW w:w="3365" w:type="pct"/>
+            <w:tcBorders>
+              <w:top w:val="single" w:sz="6" w:space="0" w:color="CBD5E1"/>
+              <w:left w:val="single" w:sz="6" w:space="0" w:color="CBD5E1"/>
+              <w:bottom w:val="single" w:sz="6" w:space="0" w:color="CBD5E1"/>
+              <w:right w:val="single" w:sz="6" w:space="0" w:color="CBD5E1"/>
+            </w:tcBorders>
+            <w:tcMar>
+              <w:top w:w="80" w:type="dxa"/>
+              <w:left w:w="120" w:type="dxa"/>
+              <w:bottom w:w="80" w:type="dxa"/>
+              <w:right w:w="120" w:type="dxa"/>
+            </w:tcMar>
+            <w:hideMark/>
+          </w:tcPr>
+          <w:p>
+            <w:pPr>
+              <w:spacing w:before="120" w:after="200"/>
+              <w:rPr>
+                <w:rFonts w:ascii="Calibri" w:eastAsia="Times New Roman" w:hAnsi="Calibri" w:cs="Calibri"/>
+                <w:color w:val="1F2937"/>
+                <w:sz w:val="20"/>
+                <w:szCs w:val="20"/>
+              </w:rPr>
+            </w:pPr>
+            <w:r>
+              <w:rPr>
+                <w:rFonts w:ascii="Calibri" w:eastAsia="Times New Roman" w:hAnsi="Calibri" w:cs="Calibri"/>
+                <w:color w:val="1F2937"/>
+                <w:sz w:val="20"/>
+                <w:szCs w:val="20"/>
+              </w:rPr>
+              <w:t>Automatic redeploy of the online link when code changes</w:t>
+            </w:r>
+          </w:p>
+        </w:tc>
+        <w:tc>
+          <w:tcPr>
+            <w:tcW w:w="1635" w:type="pct"/>
+            <w:tcBorders>
+              <w:top w:val="single" w:sz="6" w:space="0" w:color="CBD5E1"/>
+              <w:left w:val="single" w:sz="6" w:space="0" w:color="CBD5E1"/>
+              <w:bottom w:val="single" w:sz="6" w:space="0" w:color="CBD5E1"/>
+              <w:right w:val="single" w:sz="6" w:space="0" w:color="CBD5E1"/>
+            </w:tcBorders>
+            <w:tcMar>
+              <w:top w:w="80" w:type="dxa"/>
+              <w:left w:w="120" w:type="dxa"/>
+              <w:bottom w:w="80" w:type="dxa"/>
+              <w:right w:w="120" w:type="dxa"/>
+            </w:tcMar>
+            <w:hideMark/>
+          </w:tcPr>
+          <w:p>
+            <w:pPr>
+              <w:spacing w:before="120" w:after="200"/>
+              <w:rPr>
+                <w:rFonts w:ascii="Calibri" w:eastAsia="Times New Roman" w:hAnsi="Calibri" w:cs="Calibri"/>
+                <w:color w:val="1F2937"/>
+                <w:sz w:val="20"/>
+                <w:szCs w:val="20"/>
+              </w:rPr>
+            </w:pPr>
+            <w:r>
+              <w:rPr>
+                <w:rFonts w:ascii="Calibri" w:eastAsia="Times New Roman" w:hAnsi="Calibri" w:cs="Calibri"/>
+                <w:b/>
+                <w:bCs/>
+                <w:color w:val="1E40AF"/>
+                <w:sz w:val="20"/>
+                <w:szCs w:val="20"/>
+                <w:shd w:val="clear" w:color="auto" w:fill="DBEAFE"/>
+              </w:rPr>
+              <w:t>In progress</w:t>
+            </w:r>
+            <w:r>
+              <w:rPr>
+                <w:rFonts w:ascii="Calibri" w:eastAsia="Times New Roman" w:hAnsi="Calibri" w:cs="Calibri"/>
+                <w:color w:val="1F2937"/>
+                <w:sz w:val="20"/>
+                <w:szCs w:val="20"/>
+              </w:rPr>
+              <w:t xml:space="preserve"> </w:t>
+            </w:r>
+            <w:r>
+              <w:rPr>
+                <w:rFonts w:ascii="Calibri" w:eastAsia="Times New Roman" w:hAnsi="Calibri" w:cs="Calibri"/>
+                <w:color w:val="1F2937"/>
+                <w:sz w:val="20"/>
+                <w:szCs w:val="20"/>
+              </w:rPr>
+              <w:t>Needs Railway sign-in</w:t>
             </w:r>
           </w:p>
         </w:tc>
@@ -6912,179 +6483,80 @@
       <w:tr>
         <w:tc>
           <w:tcPr>
-            <w:tcW w:w="3140" w:type="pct"/>
-            <w:tcBorders>
-              <w:top w:val="single" w:sz="6" w:space="0" w:color="CBD5E1"/>
-              <w:left w:val="single" w:sz="6" w:space="0" w:color="CBD5E1"/>
-              <w:bottom w:val="single" w:sz="6" w:space="0" w:color="CBD5E1"/>
-              <w:right w:val="single" w:sz="6" w:space="0" w:color="CBD5E1"/>
-            </w:tcBorders>
-            <w:tcMar>
-              <w:top w:w="80" w:type="dxa"/>
-              <w:left w:w="120" w:type="dxa"/>
-              <w:bottom w:w="80" w:type="dxa"/>
-              <w:right w:w="120" w:type="dxa"/>
-            </w:tcMar>
-            <w:hideMark/>
-          </w:tcPr>
-          <w:p>
-            <w:pPr>
-              <w:spacing w:before="120" w:after="200"/>
-              <w:rPr>
-                <w:rFonts w:ascii="Calibri" w:eastAsia="Times New Roman" w:hAnsi="Calibri" w:cs="Calibri"/>
-                <w:color w:val="1F2937"/>
-                <w:sz w:val="20"/>
-                <w:szCs w:val="20"/>
-              </w:rPr>
-            </w:pPr>
-            <w:r>
-              <w:rPr>
-                <w:rFonts w:ascii="Calibri" w:eastAsia="Times New Roman" w:hAnsi="Calibri" w:cs="Calibri"/>
-                <w:color w:val="1F2937"/>
-                <w:sz w:val="20"/>
-                <w:szCs w:val="20"/>
-              </w:rPr>
-              <w:t>More Asset Lifecycle features</w:t>
-            </w:r>
-          </w:p>
-        </w:tc>
-        <w:tc>
-          <w:tcPr>
-            <w:tcW w:w="1860" w:type="pct"/>
-            <w:tcBorders>
-              <w:top w:val="single" w:sz="6" w:space="0" w:color="CBD5E1"/>
-              <w:left w:val="single" w:sz="6" w:space="0" w:color="CBD5E1"/>
-              <w:bottom w:val="single" w:sz="6" w:space="0" w:color="CBD5E1"/>
-              <w:right w:val="single" w:sz="6" w:space="0" w:color="CBD5E1"/>
-            </w:tcBorders>
-            <w:tcMar>
-              <w:top w:w="80" w:type="dxa"/>
-              <w:left w:w="120" w:type="dxa"/>
-              <w:bottom w:w="80" w:type="dxa"/>
-              <w:right w:w="120" w:type="dxa"/>
-            </w:tcMar>
-            <w:hideMark/>
-          </w:tcPr>
-          <w:p>
-            <w:pPr>
-              <w:spacing w:before="120" w:after="200"/>
-              <w:rPr>
-                <w:rFonts w:ascii="Calibri" w:eastAsia="Times New Roman" w:hAnsi="Calibri" w:cs="Calibri"/>
-                <w:color w:val="1F2937"/>
-                <w:sz w:val="20"/>
-                <w:szCs w:val="20"/>
-              </w:rPr>
-            </w:pPr>
-            <w:r>
-              <w:rPr>
-                <w:rFonts w:ascii="Calibri" w:eastAsia="Times New Roman" w:hAnsi="Calibri" w:cs="Calibri"/>
-                <w:b/>
-                <w:bCs/>
-                <w:color w:val="374151"/>
-                <w:sz w:val="20"/>
-                <w:szCs w:val="20"/>
-                <w:shd w:val="clear" w:color="auto" w:fill="E5E7EB"/>
-              </w:rPr>
-              <w:t>Not started</w:t>
-            </w:r>
-            <w:r>
-              <w:rPr>
-                <w:rFonts w:ascii="Calibri" w:eastAsia="Times New Roman" w:hAnsi="Calibri" w:cs="Calibri"/>
-                <w:color w:val="1F2937"/>
-                <w:sz w:val="20"/>
-                <w:szCs w:val="20"/>
-              </w:rPr>
-              <w:t xml:space="preserve"> Waiting on requirements</w:t>
-            </w:r>
-          </w:p>
-        </w:tc>
-      </w:tr>
-      <w:tr>
-        <w:tc>
-          <w:tcPr>
-            <w:tcW w:w="3140" w:type="pct"/>
-            <w:tcBorders>
-              <w:top w:val="single" w:sz="6" w:space="0" w:color="CBD5E1"/>
-              <w:left w:val="single" w:sz="6" w:space="0" w:color="CBD5E1"/>
-              <w:bottom w:val="single" w:sz="6" w:space="0" w:color="CBD5E1"/>
-              <w:right w:val="single" w:sz="6" w:space="0" w:color="CBD5E1"/>
-            </w:tcBorders>
-            <w:tcMar>
-              <w:top w:w="80" w:type="dxa"/>
-              <w:left w:w="120" w:type="dxa"/>
-              <w:bottom w:w="80" w:type="dxa"/>
-              <w:right w:w="120" w:type="dxa"/>
-            </w:tcMar>
-            <w:hideMark/>
-          </w:tcPr>
-          <w:p>
-            <w:pPr>
-              <w:spacing w:before="120" w:after="200"/>
-              <w:rPr>
-                <w:rFonts w:ascii="Calibri" w:eastAsia="Times New Roman" w:hAnsi="Calibri" w:cs="Calibri"/>
-                <w:color w:val="1F2937"/>
-                <w:sz w:val="20"/>
-                <w:szCs w:val="20"/>
-              </w:rPr>
-            </w:pPr>
-            <w:r>
-              <w:rPr>
-                <w:rFonts w:ascii="Calibri" w:eastAsia="Times New Roman" w:hAnsi="Calibri" w:cs="Calibri"/>
-                <w:color w:val="1F2937"/>
-                <w:sz w:val="20"/>
-                <w:szCs w:val="20"/>
-              </w:rPr>
-              <w:t>LMS data saved centrally rather than per computer</w:t>
-            </w:r>
-          </w:p>
-        </w:tc>
-        <w:tc>
-          <w:tcPr>
-            <w:tcW w:w="1860" w:type="pct"/>
-            <w:tcBorders>
-              <w:top w:val="single" w:sz="6" w:space="0" w:color="CBD5E1"/>
-              <w:left w:val="single" w:sz="6" w:space="0" w:color="CBD5E1"/>
-              <w:bottom w:val="single" w:sz="6" w:space="0" w:color="CBD5E1"/>
-              <w:right w:val="single" w:sz="6" w:space="0" w:color="CBD5E1"/>
-            </w:tcBorders>
-            <w:tcMar>
-              <w:top w:w="80" w:type="dxa"/>
-              <w:left w:w="120" w:type="dxa"/>
-              <w:bottom w:w="80" w:type="dxa"/>
-              <w:right w:w="120" w:type="dxa"/>
-            </w:tcMar>
-            <w:hideMark/>
-          </w:tcPr>
-          <w:p>
-            <w:pPr>
-              <w:spacing w:before="120" w:after="200"/>
-              <w:rPr>
-                <w:rFonts w:ascii="Calibri" w:eastAsia="Times New Roman" w:hAnsi="Calibri" w:cs="Calibri"/>
-                <w:color w:val="1F2937"/>
-                <w:sz w:val="20"/>
-                <w:szCs w:val="20"/>
-              </w:rPr>
-            </w:pPr>
-            <w:r>
-              <w:rPr>
-                <w:rFonts w:ascii="Calibri" w:eastAsia="Times New Roman" w:hAnsi="Calibri" w:cs="Calibri"/>
-                <w:b/>
-                <w:bCs/>
-                <w:color w:val="374151"/>
-                <w:sz w:val="20"/>
-                <w:szCs w:val="20"/>
-                <w:shd w:val="clear" w:color="auto" w:fill="E5E7EB"/>
-              </w:rPr>
-              <w:t>Not started</w:t>
-            </w:r>
-            <w:r>
-              <w:rPr>
-                <w:rFonts w:ascii="Calibri" w:eastAsia="Times New Roman" w:hAnsi="Calibri" w:cs="Calibri"/>
-                <w:color w:val="1F2937"/>
-                <w:sz w:val="20"/>
-                <w:szCs w:val="20"/>
-              </w:rPr>
-              <w:t xml:space="preserve"> Depends on the database decision</w:t>
+            <w:tcW w:w="3365" w:type="pct"/>
+            <w:tcBorders>
+              <w:top w:val="single" w:sz="6" w:space="0" w:color="CBD5E1"/>
+              <w:left w:val="single" w:sz="6" w:space="0" w:color="CBD5E1"/>
+              <w:bottom w:val="single" w:sz="6" w:space="0" w:color="CBD5E1"/>
+              <w:right w:val="single" w:sz="6" w:space="0" w:color="CBD5E1"/>
+            </w:tcBorders>
+            <w:tcMar>
+              <w:top w:w="80" w:type="dxa"/>
+              <w:left w:w="120" w:type="dxa"/>
+              <w:bottom w:w="80" w:type="dxa"/>
+              <w:right w:w="120" w:type="dxa"/>
+            </w:tcMar>
+            <w:hideMark/>
+          </w:tcPr>
+          <w:p>
+            <w:pPr>
+              <w:spacing w:before="120" w:after="200"/>
+              <w:rPr>
+                <w:rFonts w:ascii="Calibri" w:eastAsia="Times New Roman" w:hAnsi="Calibri" w:cs="Calibri"/>
+                <w:color w:val="1F2937"/>
+                <w:sz w:val="20"/>
+                <w:szCs w:val="20"/>
+              </w:rPr>
+            </w:pPr>
+            <w:r>
+              <w:rPr>
+                <w:rFonts w:ascii="Calibri" w:eastAsia="Times New Roman" w:hAnsi="Calibri" w:cs="Calibri"/>
+                <w:color w:val="1F2937"/>
+                <w:sz w:val="20"/>
+                <w:szCs w:val="20"/>
+              </w:rPr>
+              <w:t>Security update of a flagged software package</w:t>
+            </w:r>
+          </w:p>
+        </w:tc>
+        <w:tc>
+          <w:tcPr>
+            <w:tcW w:w="1635" w:type="pct"/>
+            <w:tcBorders>
+              <w:top w:val="single" w:sz="6" w:space="0" w:color="CBD5E1"/>
+              <w:left w:val="single" w:sz="6" w:space="0" w:color="CBD5E1"/>
+              <w:bottom w:val="single" w:sz="6" w:space="0" w:color="CBD5E1"/>
+              <w:right w:val="single" w:sz="6" w:space="0" w:color="CBD5E1"/>
+            </w:tcBorders>
+            <w:tcMar>
+              <w:top w:w="80" w:type="dxa"/>
+              <w:left w:w="120" w:type="dxa"/>
+              <w:bottom w:w="80" w:type="dxa"/>
+              <w:right w:w="120" w:type="dxa"/>
+            </w:tcMar>
+            <w:hideMark/>
+          </w:tcPr>
+          <w:p>
+            <w:pPr>
+              <w:spacing w:before="120" w:after="200"/>
+              <w:rPr>
+                <w:rFonts w:ascii="Calibri" w:eastAsia="Times New Roman" w:hAnsi="Calibri" w:cs="Calibri"/>
+                <w:color w:val="1F2937"/>
+                <w:sz w:val="20"/>
+                <w:szCs w:val="20"/>
+              </w:rPr>
+            </w:pPr>
+            <w:r>
+              <w:rPr>
+                <w:rFonts w:ascii="Calibri" w:eastAsia="Times New Roman" w:hAnsi="Calibri" w:cs="Calibri"/>
+                <w:b/>
+                <w:bCs/>
+                <w:color w:val="065F46"/>
+                <w:sz w:val="20"/>
+                <w:szCs w:val="20"/>
+                <w:shd w:val="clear" w:color="auto" w:fill="D1FAE5"/>
+              </w:rPr>
+              <w:t>Done</w:t>
             </w:r>
           </w:p>
         </w:tc>
@@ -7092,822 +6564,6 @@
     </w:tbl>
     <w:p>
       <w:pPr>
-        <w:pStyle w:val="Heading3"/>
-        <w:rPr>
-          <w:rFonts w:ascii="Calibri" w:eastAsia="Times New Roman" w:hAnsi="Calibri" w:cs="Calibri"/>
-        </w:rPr>
-      </w:pPr>
-      <w:r>
-        <w:rPr>
-          <w:rFonts w:ascii="Calibri" w:eastAsia="Times New Roman" w:hAnsi="Calibri" w:cs="Calibri"/>
-        </w:rPr>
-        <w:t>3.9 Data, hosting and maintenance</w:t>
-      </w:r>
-    </w:p>
-    <w:tbl>
-      <w:tblPr>
-        <w:tblW w:w="5000" w:type="pct"/>
-        <w:tblCellMar>
-          <w:top w:w="15" w:type="dxa"/>
-          <w:left w:w="15" w:type="dxa"/>
-          <w:bottom w:w="15" w:type="dxa"/>
-          <w:right w:w="15" w:type="dxa"/>
-        </w:tblCellMar>
-        <w:tblLook w:val="04A0" w:firstRow="1" w:lastRow="0" w:firstColumn="1" w:lastColumn="0" w:noHBand="0" w:noVBand="1"/>
-      </w:tblPr>
-      <w:tblGrid>
-        <w:gridCol w:w="4865"/>
-        <w:gridCol w:w="4865"/>
-      </w:tblGrid>
-      <w:tr>
-        <w:trPr>
-          <w:tblHeader/>
-        </w:trPr>
-        <w:tc>
-          <w:tcPr>
-            <w:tcW w:w="2500" w:type="pct"/>
-            <w:tcBorders>
-              <w:top w:val="single" w:sz="6" w:space="0" w:color="0F2A4A"/>
-              <w:left w:val="single" w:sz="6" w:space="0" w:color="0F2A4A"/>
-              <w:bottom w:val="single" w:sz="6" w:space="0" w:color="0F2A4A"/>
-              <w:right w:val="single" w:sz="6" w:space="0" w:color="0F2A4A"/>
-            </w:tcBorders>
-            <w:shd w:val="clear" w:color="auto" w:fill="0F2A4A"/>
-            <w:tcMar>
-              <w:top w:w="80" w:type="dxa"/>
-              <w:left w:w="120" w:type="dxa"/>
-              <w:bottom w:w="80" w:type="dxa"/>
-              <w:right w:w="120" w:type="dxa"/>
-            </w:tcMar>
-            <w:vAlign w:val="center"/>
-            <w:hideMark/>
-          </w:tcPr>
-          <w:p>
-            <w:pPr>
-              <w:spacing w:before="120" w:after="200"/>
-              <w:rPr>
-                <w:rFonts w:ascii="Calibri" w:eastAsia="Times New Roman" w:hAnsi="Calibri" w:cs="Calibri"/>
-                <w:b/>
-                <w:bCs/>
-                <w:color w:val="FFFFFF"/>
-                <w:sz w:val="20"/>
-                <w:szCs w:val="20"/>
-              </w:rPr>
-            </w:pPr>
-            <w:r>
-              <w:rPr>
-                <w:rFonts w:ascii="Calibri" w:eastAsia="Times New Roman" w:hAnsi="Calibri" w:cs="Calibri"/>
-                <w:b/>
-                <w:bCs/>
-                <w:color w:val="FFFFFF"/>
-                <w:sz w:val="20"/>
-                <w:szCs w:val="20"/>
-              </w:rPr>
-              <w:t>Requirement</w:t>
-            </w:r>
-          </w:p>
-        </w:tc>
-        <w:tc>
-          <w:tcPr>
-            <w:tcW w:w="2500" w:type="pct"/>
-            <w:tcBorders>
-              <w:top w:val="single" w:sz="6" w:space="0" w:color="0F2A4A"/>
-              <w:left w:val="single" w:sz="6" w:space="0" w:color="0F2A4A"/>
-              <w:bottom w:val="single" w:sz="6" w:space="0" w:color="0F2A4A"/>
-              <w:right w:val="single" w:sz="6" w:space="0" w:color="0F2A4A"/>
-            </w:tcBorders>
-            <w:shd w:val="clear" w:color="auto" w:fill="0F2A4A"/>
-            <w:tcMar>
-              <w:top w:w="80" w:type="dxa"/>
-              <w:left w:w="120" w:type="dxa"/>
-              <w:bottom w:w="80" w:type="dxa"/>
-              <w:right w:w="120" w:type="dxa"/>
-            </w:tcMar>
-            <w:vAlign w:val="center"/>
-            <w:hideMark/>
-          </w:tcPr>
-          <w:p>
-            <w:pPr>
-              <w:spacing w:before="120" w:after="200"/>
-              <w:rPr>
-                <w:rFonts w:ascii="Calibri" w:eastAsia="Times New Roman" w:hAnsi="Calibri" w:cs="Calibri"/>
-                <w:b/>
-                <w:bCs/>
-                <w:color w:val="FFFFFF"/>
-                <w:sz w:val="20"/>
-                <w:szCs w:val="20"/>
-              </w:rPr>
-            </w:pPr>
-            <w:r>
-              <w:rPr>
-                <w:rFonts w:ascii="Calibri" w:eastAsia="Times New Roman" w:hAnsi="Calibri" w:cs="Calibri"/>
-                <w:b/>
-                <w:bCs/>
-                <w:color w:val="FFFFFF"/>
-                <w:sz w:val="20"/>
-                <w:szCs w:val="20"/>
-              </w:rPr>
-              <w:t>Status</w:t>
-            </w:r>
-          </w:p>
-        </w:tc>
-      </w:tr>
-      <w:tr>
-        <w:tc>
-          <w:tcPr>
-            <w:tcW w:w="2500" w:type="pct"/>
-            <w:tcBorders>
-              <w:top w:val="single" w:sz="6" w:space="0" w:color="CBD5E1"/>
-              <w:left w:val="single" w:sz="6" w:space="0" w:color="CBD5E1"/>
-              <w:bottom w:val="single" w:sz="6" w:space="0" w:color="CBD5E1"/>
-              <w:right w:val="single" w:sz="6" w:space="0" w:color="CBD5E1"/>
-            </w:tcBorders>
-            <w:tcMar>
-              <w:top w:w="80" w:type="dxa"/>
-              <w:left w:w="120" w:type="dxa"/>
-              <w:bottom w:w="80" w:type="dxa"/>
-              <w:right w:w="120" w:type="dxa"/>
-            </w:tcMar>
-            <w:hideMark/>
-          </w:tcPr>
-          <w:p>
-            <w:pPr>
-              <w:spacing w:before="120" w:after="200"/>
-              <w:rPr>
-                <w:rFonts w:ascii="Calibri" w:eastAsia="Times New Roman" w:hAnsi="Calibri" w:cs="Calibri"/>
-                <w:color w:val="1F2937"/>
-                <w:sz w:val="20"/>
-                <w:szCs w:val="20"/>
-              </w:rPr>
-            </w:pPr>
-            <w:r>
-              <w:rPr>
-                <w:rFonts w:ascii="Calibri" w:eastAsia="Times New Roman" w:hAnsi="Calibri" w:cs="Calibri"/>
-                <w:color w:val="1F2937"/>
-                <w:sz w:val="20"/>
-                <w:szCs w:val="20"/>
-              </w:rPr>
-              <w:t>SQL Server database design and setup scripts</w:t>
-            </w:r>
-          </w:p>
-        </w:tc>
-        <w:tc>
-          <w:tcPr>
-            <w:tcW w:w="2500" w:type="pct"/>
-            <w:tcBorders>
-              <w:top w:val="single" w:sz="6" w:space="0" w:color="CBD5E1"/>
-              <w:left w:val="single" w:sz="6" w:space="0" w:color="CBD5E1"/>
-              <w:bottom w:val="single" w:sz="6" w:space="0" w:color="CBD5E1"/>
-              <w:right w:val="single" w:sz="6" w:space="0" w:color="CBD5E1"/>
-            </w:tcBorders>
-            <w:tcMar>
-              <w:top w:w="80" w:type="dxa"/>
-              <w:left w:w="120" w:type="dxa"/>
-              <w:bottom w:w="80" w:type="dxa"/>
-              <w:right w:w="120" w:type="dxa"/>
-            </w:tcMar>
-            <w:hideMark/>
-          </w:tcPr>
-          <w:p>
-            <w:pPr>
-              <w:spacing w:before="120" w:after="200"/>
-              <w:rPr>
-                <w:rFonts w:ascii="Calibri" w:eastAsia="Times New Roman" w:hAnsi="Calibri" w:cs="Calibri"/>
-                <w:color w:val="1F2937"/>
-                <w:sz w:val="20"/>
-                <w:szCs w:val="20"/>
-              </w:rPr>
-            </w:pPr>
-            <w:r>
-              <w:rPr>
-                <w:rFonts w:ascii="Calibri" w:eastAsia="Times New Roman" w:hAnsi="Calibri" w:cs="Calibri"/>
-                <w:b/>
-                <w:bCs/>
-                <w:color w:val="065F46"/>
-                <w:sz w:val="20"/>
-                <w:szCs w:val="20"/>
-                <w:shd w:val="clear" w:color="auto" w:fill="D1FAE5"/>
-              </w:rPr>
-              <w:t>Done</w:t>
-            </w:r>
-          </w:p>
-        </w:tc>
-      </w:tr>
-      <w:tr>
-        <w:tc>
-          <w:tcPr>
-            <w:tcW w:w="2500" w:type="pct"/>
-            <w:tcBorders>
-              <w:top w:val="single" w:sz="6" w:space="0" w:color="CBD5E1"/>
-              <w:left w:val="single" w:sz="6" w:space="0" w:color="CBD5E1"/>
-              <w:bottom w:val="single" w:sz="6" w:space="0" w:color="CBD5E1"/>
-              <w:right w:val="single" w:sz="6" w:space="0" w:color="CBD5E1"/>
-            </w:tcBorders>
-            <w:tcMar>
-              <w:top w:w="80" w:type="dxa"/>
-              <w:left w:w="120" w:type="dxa"/>
-              <w:bottom w:w="80" w:type="dxa"/>
-              <w:right w:w="120" w:type="dxa"/>
-            </w:tcMar>
-            <w:hideMark/>
-          </w:tcPr>
-          <w:p>
-            <w:pPr>
-              <w:spacing w:before="120" w:after="200"/>
-              <w:rPr>
-                <w:rFonts w:ascii="Calibri" w:eastAsia="Times New Roman" w:hAnsi="Calibri" w:cs="Calibri"/>
-                <w:color w:val="1F2937"/>
-                <w:sz w:val="20"/>
-                <w:szCs w:val="20"/>
-              </w:rPr>
-            </w:pPr>
-            <w:r>
-              <w:rPr>
-                <w:rFonts w:ascii="Calibri" w:eastAsia="Times New Roman" w:hAnsi="Calibri" w:cs="Calibri"/>
-                <w:color w:val="1F2937"/>
-                <w:sz w:val="20"/>
-                <w:szCs w:val="20"/>
-              </w:rPr>
-              <w:t>New database scripts for BOM, Pastel and LMS access</w:t>
-            </w:r>
-          </w:p>
-        </w:tc>
-        <w:tc>
-          <w:tcPr>
-            <w:tcW w:w="2500" w:type="pct"/>
-            <w:tcBorders>
-              <w:top w:val="single" w:sz="6" w:space="0" w:color="CBD5E1"/>
-              <w:left w:val="single" w:sz="6" w:space="0" w:color="CBD5E1"/>
-              <w:bottom w:val="single" w:sz="6" w:space="0" w:color="CBD5E1"/>
-              <w:right w:val="single" w:sz="6" w:space="0" w:color="CBD5E1"/>
-            </w:tcBorders>
-            <w:tcMar>
-              <w:top w:w="80" w:type="dxa"/>
-              <w:left w:w="120" w:type="dxa"/>
-              <w:bottom w:w="80" w:type="dxa"/>
-              <w:right w:w="120" w:type="dxa"/>
-            </w:tcMar>
-            <w:hideMark/>
-          </w:tcPr>
-          <w:p>
-            <w:pPr>
-              <w:spacing w:before="120" w:after="200"/>
-              <w:rPr>
-                <w:rFonts w:ascii="Calibri" w:eastAsia="Times New Roman" w:hAnsi="Calibri" w:cs="Calibri"/>
-                <w:color w:val="1F2937"/>
-                <w:sz w:val="20"/>
-                <w:szCs w:val="20"/>
-              </w:rPr>
-            </w:pPr>
-            <w:r>
-              <w:rPr>
-                <w:rFonts w:ascii="Calibri" w:eastAsia="Times New Roman" w:hAnsi="Calibri" w:cs="Calibri"/>
-                <w:b/>
-                <w:bCs/>
-                <w:color w:val="065F46"/>
-                <w:sz w:val="20"/>
-                <w:szCs w:val="20"/>
-                <w:shd w:val="clear" w:color="auto" w:fill="D1FAE5"/>
-              </w:rPr>
-              <w:t>Done</w:t>
-            </w:r>
-            <w:r>
-              <w:rPr>
-                <w:rFonts w:ascii="Calibri" w:eastAsia="Times New Roman" w:hAnsi="Calibri" w:cs="Calibri"/>
-                <w:color w:val="1F2937"/>
-                <w:sz w:val="20"/>
-                <w:szCs w:val="20"/>
-              </w:rPr>
-              <w:t xml:space="preserve"> Written, not yet run</w:t>
-            </w:r>
-          </w:p>
-        </w:tc>
-      </w:tr>
-      <w:tr>
-        <w:tc>
-          <w:tcPr>
-            <w:tcW w:w="2500" w:type="pct"/>
-            <w:tcBorders>
-              <w:top w:val="single" w:sz="6" w:space="0" w:color="CBD5E1"/>
-              <w:left w:val="single" w:sz="6" w:space="0" w:color="CBD5E1"/>
-              <w:bottom w:val="single" w:sz="6" w:space="0" w:color="CBD5E1"/>
-              <w:right w:val="single" w:sz="6" w:space="0" w:color="CBD5E1"/>
-            </w:tcBorders>
-            <w:tcMar>
-              <w:top w:w="80" w:type="dxa"/>
-              <w:left w:w="120" w:type="dxa"/>
-              <w:bottom w:w="80" w:type="dxa"/>
-              <w:right w:w="120" w:type="dxa"/>
-            </w:tcMar>
-            <w:hideMark/>
-          </w:tcPr>
-          <w:p>
-            <w:pPr>
-              <w:spacing w:before="120" w:after="200"/>
-              <w:rPr>
-                <w:rFonts w:ascii="Calibri" w:eastAsia="Times New Roman" w:hAnsi="Calibri" w:cs="Calibri"/>
-                <w:color w:val="1F2937"/>
-                <w:sz w:val="20"/>
-                <w:szCs w:val="20"/>
-              </w:rPr>
-            </w:pPr>
-            <w:r>
-              <w:rPr>
-                <w:rFonts w:ascii="Calibri" w:eastAsia="Times New Roman" w:hAnsi="Calibri" w:cs="Calibri"/>
-                <w:color w:val="1F2937"/>
-                <w:sz w:val="20"/>
-                <w:szCs w:val="20"/>
-              </w:rPr>
-              <w:t>Offline mode, so the app still works when the database can't be reached</w:t>
-            </w:r>
-          </w:p>
-        </w:tc>
-        <w:tc>
-          <w:tcPr>
-            <w:tcW w:w="2500" w:type="pct"/>
-            <w:tcBorders>
-              <w:top w:val="single" w:sz="6" w:space="0" w:color="CBD5E1"/>
-              <w:left w:val="single" w:sz="6" w:space="0" w:color="CBD5E1"/>
-              <w:bottom w:val="single" w:sz="6" w:space="0" w:color="CBD5E1"/>
-              <w:right w:val="single" w:sz="6" w:space="0" w:color="CBD5E1"/>
-            </w:tcBorders>
-            <w:tcMar>
-              <w:top w:w="80" w:type="dxa"/>
-              <w:left w:w="120" w:type="dxa"/>
-              <w:bottom w:w="80" w:type="dxa"/>
-              <w:right w:w="120" w:type="dxa"/>
-            </w:tcMar>
-            <w:hideMark/>
-          </w:tcPr>
-          <w:p>
-            <w:pPr>
-              <w:spacing w:before="120" w:after="200"/>
-              <w:rPr>
-                <w:rFonts w:ascii="Calibri" w:eastAsia="Times New Roman" w:hAnsi="Calibri" w:cs="Calibri"/>
-                <w:color w:val="1F2937"/>
-                <w:sz w:val="20"/>
-                <w:szCs w:val="20"/>
-              </w:rPr>
-            </w:pPr>
-            <w:r>
-              <w:rPr>
-                <w:rFonts w:ascii="Calibri" w:eastAsia="Times New Roman" w:hAnsi="Calibri" w:cs="Calibri"/>
-                <w:b/>
-                <w:bCs/>
-                <w:color w:val="065F46"/>
-                <w:sz w:val="20"/>
-                <w:szCs w:val="20"/>
-                <w:shd w:val="clear" w:color="auto" w:fill="D1FAE5"/>
-              </w:rPr>
-              <w:t>Done</w:t>
-            </w:r>
-          </w:p>
-        </w:tc>
-      </w:tr>
-      <w:tr>
-        <w:tc>
-          <w:tcPr>
-            <w:tcW w:w="2500" w:type="pct"/>
-            <w:tcBorders>
-              <w:top w:val="single" w:sz="6" w:space="0" w:color="CBD5E1"/>
-              <w:left w:val="single" w:sz="6" w:space="0" w:color="CBD5E1"/>
-              <w:bottom w:val="single" w:sz="6" w:space="0" w:color="CBD5E1"/>
-              <w:right w:val="single" w:sz="6" w:space="0" w:color="CBD5E1"/>
-            </w:tcBorders>
-            <w:tcMar>
-              <w:top w:w="80" w:type="dxa"/>
-              <w:left w:w="120" w:type="dxa"/>
-              <w:bottom w:w="80" w:type="dxa"/>
-              <w:right w:w="120" w:type="dxa"/>
-            </w:tcMar>
-            <w:hideMark/>
-          </w:tcPr>
-          <w:p>
-            <w:pPr>
-              <w:spacing w:before="120" w:after="200"/>
-              <w:rPr>
-                <w:rFonts w:ascii="Calibri" w:eastAsia="Times New Roman" w:hAnsi="Calibri" w:cs="Calibri"/>
-                <w:color w:val="1F2937"/>
-                <w:sz w:val="20"/>
-                <w:szCs w:val="20"/>
-              </w:rPr>
-            </w:pPr>
-            <w:r>
-              <w:rPr>
-                <w:rFonts w:ascii="Calibri" w:eastAsia="Times New Roman" w:hAnsi="Calibri" w:cs="Calibri"/>
-                <w:color w:val="1F2937"/>
-                <w:sz w:val="20"/>
-                <w:szCs w:val="20"/>
-              </w:rPr>
-              <w:t>Live SQL Server database connected</w:t>
-            </w:r>
-          </w:p>
-        </w:tc>
-        <w:tc>
-          <w:tcPr>
-            <w:tcW w:w="2500" w:type="pct"/>
-            <w:tcBorders>
-              <w:top w:val="single" w:sz="6" w:space="0" w:color="CBD5E1"/>
-              <w:left w:val="single" w:sz="6" w:space="0" w:color="CBD5E1"/>
-              <w:bottom w:val="single" w:sz="6" w:space="0" w:color="CBD5E1"/>
-              <w:right w:val="single" w:sz="6" w:space="0" w:color="CBD5E1"/>
-            </w:tcBorders>
-            <w:tcMar>
-              <w:top w:w="80" w:type="dxa"/>
-              <w:left w:w="120" w:type="dxa"/>
-              <w:bottom w:w="80" w:type="dxa"/>
-              <w:right w:w="120" w:type="dxa"/>
-            </w:tcMar>
-            <w:hideMark/>
-          </w:tcPr>
-          <w:p>
-            <w:pPr>
-              <w:spacing w:before="120" w:after="200"/>
-              <w:rPr>
-                <w:rFonts w:ascii="Calibri" w:eastAsia="Times New Roman" w:hAnsi="Calibri" w:cs="Calibri"/>
-                <w:color w:val="1F2937"/>
-                <w:sz w:val="20"/>
-                <w:szCs w:val="20"/>
-              </w:rPr>
-            </w:pPr>
-            <w:r>
-              <w:rPr>
-                <w:rFonts w:ascii="Calibri" w:eastAsia="Times New Roman" w:hAnsi="Calibri" w:cs="Calibri"/>
-                <w:b/>
-                <w:bCs/>
-                <w:color w:val="374151"/>
-                <w:sz w:val="20"/>
-                <w:szCs w:val="20"/>
-                <w:shd w:val="clear" w:color="auto" w:fill="E5E7EB"/>
-              </w:rPr>
-              <w:t>Not started</w:t>
-            </w:r>
-            <w:r>
-              <w:rPr>
-                <w:rFonts w:ascii="Calibri" w:eastAsia="Times New Roman" w:hAnsi="Calibri" w:cs="Calibri"/>
-                <w:color w:val="1F2937"/>
-                <w:sz w:val="20"/>
-                <w:szCs w:val="20"/>
-              </w:rPr>
-              <w:t xml:space="preserve"> Decision pending</w:t>
-            </w:r>
-          </w:p>
-        </w:tc>
-      </w:tr>
-      <w:tr>
-        <w:tc>
-          <w:tcPr>
-            <w:tcW w:w="2500" w:type="pct"/>
-            <w:tcBorders>
-              <w:top w:val="single" w:sz="6" w:space="0" w:color="CBD5E1"/>
-              <w:left w:val="single" w:sz="6" w:space="0" w:color="CBD5E1"/>
-              <w:bottom w:val="single" w:sz="6" w:space="0" w:color="CBD5E1"/>
-              <w:right w:val="single" w:sz="6" w:space="0" w:color="CBD5E1"/>
-            </w:tcBorders>
-            <w:tcMar>
-              <w:top w:w="80" w:type="dxa"/>
-              <w:left w:w="120" w:type="dxa"/>
-              <w:bottom w:w="80" w:type="dxa"/>
-              <w:right w:w="120" w:type="dxa"/>
-            </w:tcMar>
-            <w:hideMark/>
-          </w:tcPr>
-          <w:p>
-            <w:pPr>
-              <w:spacing w:before="120" w:after="200"/>
-              <w:rPr>
-                <w:rFonts w:ascii="Calibri" w:eastAsia="Times New Roman" w:hAnsi="Calibri" w:cs="Calibri"/>
-                <w:color w:val="1F2937"/>
-                <w:sz w:val="20"/>
-                <w:szCs w:val="20"/>
-              </w:rPr>
-            </w:pPr>
-            <w:r>
-              <w:rPr>
-                <w:rFonts w:ascii="Calibri" w:eastAsia="Times New Roman" w:hAnsi="Calibri" w:cs="Calibri"/>
-                <w:color w:val="1F2937"/>
-                <w:sz w:val="20"/>
-                <w:szCs w:val="20"/>
-              </w:rPr>
-              <w:t>Online demo link (Railway)</w:t>
-            </w:r>
-          </w:p>
-        </w:tc>
-        <w:tc>
-          <w:tcPr>
-            <w:tcW w:w="2500" w:type="pct"/>
-            <w:tcBorders>
-              <w:top w:val="single" w:sz="6" w:space="0" w:color="CBD5E1"/>
-              <w:left w:val="single" w:sz="6" w:space="0" w:color="CBD5E1"/>
-              <w:bottom w:val="single" w:sz="6" w:space="0" w:color="CBD5E1"/>
-              <w:right w:val="single" w:sz="6" w:space="0" w:color="CBD5E1"/>
-            </w:tcBorders>
-            <w:tcMar>
-              <w:top w:w="80" w:type="dxa"/>
-              <w:left w:w="120" w:type="dxa"/>
-              <w:bottom w:w="80" w:type="dxa"/>
-              <w:right w:w="120" w:type="dxa"/>
-            </w:tcMar>
-            <w:hideMark/>
-          </w:tcPr>
-          <w:p>
-            <w:pPr>
-              <w:spacing w:before="120" w:after="200"/>
-              <w:rPr>
-                <w:rFonts w:ascii="Calibri" w:eastAsia="Times New Roman" w:hAnsi="Calibri" w:cs="Calibri"/>
-                <w:color w:val="1F2937"/>
-                <w:sz w:val="20"/>
-                <w:szCs w:val="20"/>
-              </w:rPr>
-            </w:pPr>
-            <w:r>
-              <w:rPr>
-                <w:rFonts w:ascii="Calibri" w:eastAsia="Times New Roman" w:hAnsi="Calibri" w:cs="Calibri"/>
-                <w:b/>
-                <w:bCs/>
-                <w:color w:val="065F46"/>
-                <w:sz w:val="20"/>
-                <w:szCs w:val="20"/>
-                <w:shd w:val="clear" w:color="auto" w:fill="D1FAE5"/>
-              </w:rPr>
-              <w:t>Done</w:t>
-            </w:r>
-            <w:r>
-              <w:rPr>
-                <w:rFonts w:ascii="Calibri" w:eastAsia="Times New Roman" w:hAnsi="Calibri" w:cs="Calibri"/>
-                <w:color w:val="1F2937"/>
-                <w:sz w:val="20"/>
-                <w:szCs w:val="20"/>
-              </w:rPr>
-              <w:t xml:space="preserve"> Demo only</w:t>
-            </w:r>
-          </w:p>
-        </w:tc>
-      </w:tr>
-      <w:tr>
-        <w:tc>
-          <w:tcPr>
-            <w:tcW w:w="2500" w:type="pct"/>
-            <w:tcBorders>
-              <w:top w:val="single" w:sz="6" w:space="0" w:color="CBD5E1"/>
-              <w:left w:val="single" w:sz="6" w:space="0" w:color="CBD5E1"/>
-              <w:bottom w:val="single" w:sz="6" w:space="0" w:color="CBD5E1"/>
-              <w:right w:val="single" w:sz="6" w:space="0" w:color="CBD5E1"/>
-            </w:tcBorders>
-            <w:tcMar>
-              <w:top w:w="80" w:type="dxa"/>
-              <w:left w:w="120" w:type="dxa"/>
-              <w:bottom w:w="80" w:type="dxa"/>
-              <w:right w:w="120" w:type="dxa"/>
-            </w:tcMar>
-            <w:hideMark/>
-          </w:tcPr>
-          <w:p>
-            <w:pPr>
-              <w:spacing w:before="120" w:after="200"/>
-              <w:rPr>
-                <w:rFonts w:ascii="Calibri" w:eastAsia="Times New Roman" w:hAnsi="Calibri" w:cs="Calibri"/>
-                <w:color w:val="1F2937"/>
-                <w:sz w:val="20"/>
-                <w:szCs w:val="20"/>
-              </w:rPr>
-            </w:pPr>
-            <w:r>
-              <w:rPr>
-                <w:rFonts w:ascii="Calibri" w:eastAsia="Times New Roman" w:hAnsi="Calibri" w:cs="Calibri"/>
-                <w:color w:val="1F2937"/>
-                <w:sz w:val="20"/>
-                <w:szCs w:val="20"/>
-              </w:rPr>
-              <w:t>Code backed up in a private GitHub repository</w:t>
-            </w:r>
-          </w:p>
-        </w:tc>
-        <w:tc>
-          <w:tcPr>
-            <w:tcW w:w="2500" w:type="pct"/>
-            <w:tcBorders>
-              <w:top w:val="single" w:sz="6" w:space="0" w:color="CBD5E1"/>
-              <w:left w:val="single" w:sz="6" w:space="0" w:color="CBD5E1"/>
-              <w:bottom w:val="single" w:sz="6" w:space="0" w:color="CBD5E1"/>
-              <w:right w:val="single" w:sz="6" w:space="0" w:color="CBD5E1"/>
-            </w:tcBorders>
-            <w:tcMar>
-              <w:top w:w="80" w:type="dxa"/>
-              <w:left w:w="120" w:type="dxa"/>
-              <w:bottom w:w="80" w:type="dxa"/>
-              <w:right w:w="120" w:type="dxa"/>
-            </w:tcMar>
-            <w:hideMark/>
-          </w:tcPr>
-          <w:p>
-            <w:pPr>
-              <w:spacing w:before="120" w:after="200"/>
-              <w:rPr>
-                <w:rFonts w:ascii="Calibri" w:eastAsia="Times New Roman" w:hAnsi="Calibri" w:cs="Calibri"/>
-                <w:color w:val="1F2937"/>
-                <w:sz w:val="20"/>
-                <w:szCs w:val="20"/>
-              </w:rPr>
-            </w:pPr>
-            <w:r>
-              <w:rPr>
-                <w:rFonts w:ascii="Calibri" w:eastAsia="Times New Roman" w:hAnsi="Calibri" w:cs="Calibri"/>
-                <w:b/>
-                <w:bCs/>
-                <w:color w:val="065F46"/>
-                <w:sz w:val="20"/>
-                <w:szCs w:val="20"/>
-                <w:shd w:val="clear" w:color="auto" w:fill="D1FAE5"/>
-              </w:rPr>
-              <w:t>Done</w:t>
-            </w:r>
-          </w:p>
-        </w:tc>
-      </w:tr>
-      <w:tr>
-        <w:tc>
-          <w:tcPr>
-            <w:tcW w:w="2500" w:type="pct"/>
-            <w:tcBorders>
-              <w:top w:val="single" w:sz="6" w:space="0" w:color="CBD5E1"/>
-              <w:left w:val="single" w:sz="6" w:space="0" w:color="CBD5E1"/>
-              <w:bottom w:val="single" w:sz="6" w:space="0" w:color="CBD5E1"/>
-              <w:right w:val="single" w:sz="6" w:space="0" w:color="CBD5E1"/>
-            </w:tcBorders>
-            <w:tcMar>
-              <w:top w:w="80" w:type="dxa"/>
-              <w:left w:w="120" w:type="dxa"/>
-              <w:bottom w:w="80" w:type="dxa"/>
-              <w:right w:w="120" w:type="dxa"/>
-            </w:tcMar>
-            <w:hideMark/>
-          </w:tcPr>
-          <w:p>
-            <w:pPr>
-              <w:spacing w:before="120" w:after="200"/>
-              <w:rPr>
-                <w:rFonts w:ascii="Calibri" w:eastAsia="Times New Roman" w:hAnsi="Calibri" w:cs="Calibri"/>
-                <w:color w:val="1F2937"/>
-                <w:sz w:val="20"/>
-                <w:szCs w:val="20"/>
-              </w:rPr>
-            </w:pPr>
-            <w:r>
-              <w:rPr>
-                <w:rFonts w:ascii="Calibri" w:eastAsia="Times New Roman" w:hAnsi="Calibri" w:cs="Calibri"/>
-                <w:color w:val="1F2937"/>
-                <w:sz w:val="20"/>
-                <w:szCs w:val="20"/>
-              </w:rPr>
-              <w:t>Automatic redeploy of the online link when code changes</w:t>
-            </w:r>
-          </w:p>
-        </w:tc>
-        <w:tc>
-          <w:tcPr>
-            <w:tcW w:w="2500" w:type="pct"/>
-            <w:tcBorders>
-              <w:top w:val="single" w:sz="6" w:space="0" w:color="CBD5E1"/>
-              <w:left w:val="single" w:sz="6" w:space="0" w:color="CBD5E1"/>
-              <w:bottom w:val="single" w:sz="6" w:space="0" w:color="CBD5E1"/>
-              <w:right w:val="single" w:sz="6" w:space="0" w:color="CBD5E1"/>
-            </w:tcBorders>
-            <w:tcMar>
-              <w:top w:w="80" w:type="dxa"/>
-              <w:left w:w="120" w:type="dxa"/>
-              <w:bottom w:w="80" w:type="dxa"/>
-              <w:right w:w="120" w:type="dxa"/>
-            </w:tcMar>
-            <w:hideMark/>
-          </w:tcPr>
-          <w:p>
-            <w:pPr>
-              <w:spacing w:before="120" w:after="200"/>
-              <w:rPr>
-                <w:rFonts w:ascii="Calibri" w:eastAsia="Times New Roman" w:hAnsi="Calibri" w:cs="Calibri"/>
-                <w:color w:val="1F2937"/>
-                <w:sz w:val="20"/>
-                <w:szCs w:val="20"/>
-              </w:rPr>
-            </w:pPr>
-            <w:r>
-              <w:rPr>
-                <w:rFonts w:ascii="Calibri" w:eastAsia="Times New Roman" w:hAnsi="Calibri" w:cs="Calibri"/>
-                <w:b/>
-                <w:bCs/>
-                <w:color w:val="1E40AF"/>
-                <w:sz w:val="20"/>
-                <w:szCs w:val="20"/>
-                <w:shd w:val="clear" w:color="auto" w:fill="DBEAFE"/>
-              </w:rPr>
-              <w:t>In progress</w:t>
-            </w:r>
-            <w:r>
-              <w:rPr>
-                <w:rFonts w:ascii="Calibri" w:eastAsia="Times New Roman" w:hAnsi="Calibri" w:cs="Calibri"/>
-                <w:color w:val="1F2937"/>
-                <w:sz w:val="20"/>
-                <w:szCs w:val="20"/>
-              </w:rPr>
-              <w:t xml:space="preserve"> </w:t>
-            </w:r>
-            <w:r>
-              <w:rPr>
-                <w:rFonts w:ascii="Calibri" w:eastAsia="Times New Roman" w:hAnsi="Calibri" w:cs="Calibri"/>
-                <w:color w:val="1F2937"/>
-                <w:sz w:val="20"/>
-                <w:szCs w:val="20"/>
-              </w:rPr>
-              <w:t>Needs Railway sign-in</w:t>
-            </w:r>
-          </w:p>
-        </w:tc>
-      </w:tr>
-      <w:tr>
-        <w:tc>
-          <w:tcPr>
-            <w:tcW w:w="2500" w:type="pct"/>
-            <w:tcBorders>
-              <w:top w:val="single" w:sz="6" w:space="0" w:color="CBD5E1"/>
-              <w:left w:val="single" w:sz="6" w:space="0" w:color="CBD5E1"/>
-              <w:bottom w:val="single" w:sz="6" w:space="0" w:color="CBD5E1"/>
-              <w:right w:val="single" w:sz="6" w:space="0" w:color="CBD5E1"/>
-            </w:tcBorders>
-            <w:tcMar>
-              <w:top w:w="80" w:type="dxa"/>
-              <w:left w:w="120" w:type="dxa"/>
-              <w:bottom w:w="80" w:type="dxa"/>
-              <w:right w:w="120" w:type="dxa"/>
-            </w:tcMar>
-            <w:hideMark/>
-          </w:tcPr>
-          <w:p>
-            <w:pPr>
-              <w:spacing w:before="120" w:after="200"/>
-              <w:rPr>
-                <w:rFonts w:ascii="Calibri" w:eastAsia="Times New Roman" w:hAnsi="Calibri" w:cs="Calibri"/>
-                <w:color w:val="1F2937"/>
-                <w:sz w:val="20"/>
-                <w:szCs w:val="20"/>
-              </w:rPr>
-            </w:pPr>
-            <w:r>
-              <w:rPr>
-                <w:rFonts w:ascii="Calibri" w:eastAsia="Times New Roman" w:hAnsi="Calibri" w:cs="Calibri"/>
-                <w:color w:val="1F2937"/>
-                <w:sz w:val="20"/>
-                <w:szCs w:val="20"/>
-              </w:rPr>
-              <w:t>Security update of a flagged software package</w:t>
-            </w:r>
-          </w:p>
-        </w:tc>
-        <w:tc>
-          <w:tcPr>
-            <w:tcW w:w="2500" w:type="pct"/>
-            <w:tcBorders>
-              <w:top w:val="single" w:sz="6" w:space="0" w:color="CBD5E1"/>
-              <w:left w:val="single" w:sz="6" w:space="0" w:color="CBD5E1"/>
-              <w:bottom w:val="single" w:sz="6" w:space="0" w:color="CBD5E1"/>
-              <w:right w:val="single" w:sz="6" w:space="0" w:color="CBD5E1"/>
-            </w:tcBorders>
-            <w:tcMar>
-              <w:top w:w="80" w:type="dxa"/>
-              <w:left w:w="120" w:type="dxa"/>
-              <w:bottom w:w="80" w:type="dxa"/>
-              <w:right w:w="120" w:type="dxa"/>
-            </w:tcMar>
-            <w:hideMark/>
-          </w:tcPr>
-          <w:p>
-            <w:pPr>
-              <w:spacing w:before="120" w:after="200"/>
-              <w:rPr>
-                <w:rFonts w:ascii="Calibri" w:eastAsia="Times New Roman" w:hAnsi="Calibri" w:cs="Calibri"/>
-                <w:color w:val="1F2937"/>
-                <w:sz w:val="20"/>
-                <w:szCs w:val="20"/>
-              </w:rPr>
-            </w:pPr>
-            <w:r>
-              <w:rPr>
-                <w:rFonts w:ascii="Calibri" w:eastAsia="Times New Roman" w:hAnsi="Calibri" w:cs="Calibri"/>
-                <w:b/>
-                <w:bCs/>
-                <w:color w:val="065F46"/>
-                <w:sz w:val="20"/>
-                <w:szCs w:val="20"/>
-                <w:shd w:val="clear" w:color="auto" w:fill="D1FAE5"/>
-              </w:rPr>
-              <w:t>Done</w:t>
-            </w:r>
-          </w:p>
-        </w:tc>
-      </w:tr>
-    </w:tbl>
-    <w:p>
-      <w:pPr>
         <w:rPr>
           <w:rFonts w:ascii="Calibri" w:eastAsia="Times New Roman" w:hAnsi="Calibri" w:cs="Calibri"/>
           <w:color w:val="1F2937"/>
@@ -7922,7 +6578,7 @@
           <w:sz w:val="22"/>
           <w:szCs w:val="22"/>
         </w:rPr>
-        <w:pict w14:anchorId="6132399C">
+        <w:pict w14:anchorId="5F3470D3">
           <v:rect id="_x0000_i1028" style="width:0;height:1.5pt" o:hralign="center" o:hrstd="t" o:hr="t" fillcolor="#a0a0a0" stroked="f"/>
         </w:pict>
       </w:r>
@@ -7952,6 +6608,7 @@
         <w:rPr>
           <w:rFonts w:ascii="Calibri" w:eastAsia="Times New Roman" w:hAnsi="Calibri" w:cs="Calibri"/>
         </w:rPr>
+        <w:lastRenderedPageBreak/>
         <w:t>Completed this cycle</w:t>
       </w:r>
     </w:p>
@@ -8048,146 +6705,6 @@
           <w:sz w:val="22"/>
           <w:szCs w:val="22"/>
         </w:rPr>
-        <w:t>SMS/LMS login choice</w:t>
-      </w:r>
-      <w:r>
-        <w:rPr>
-          <w:rFonts w:ascii="Calibri" w:eastAsia="Times New Roman" w:hAnsi="Calibri" w:cs="Calibri"/>
-          <w:color w:val="1F2937"/>
-          <w:sz w:val="22"/>
-          <w:szCs w:val="22"/>
-        </w:rPr>
-        <w:t xml:space="preserve"> with blue and green themes.</w:t>
-      </w:r>
-    </w:p>
-    <w:p>
-      <w:pPr>
-        <w:numPr>
-          <w:ilvl w:val="0"/>
-          <w:numId w:val="1"/>
-        </w:numPr>
-        <w:spacing w:before="100" w:beforeAutospacing="1" w:after="100" w:afterAutospacing="1"/>
-        <w:rPr>
-          <w:rFonts w:ascii="Calibri" w:eastAsia="Times New Roman" w:hAnsi="Calibri" w:cs="Calibri"/>
-          <w:color w:val="1F2937"/>
-          <w:sz w:val="22"/>
-          <w:szCs w:val="22"/>
-        </w:rPr>
-      </w:pPr>
-      <w:r>
-        <w:rPr>
-          <w:rFonts w:ascii="Calibri" w:eastAsia="Times New Roman" w:hAnsi="Calibri" w:cs="Calibri"/>
-          <w:b/>
-          <w:bCs/>
-          <w:color w:val="1F2937"/>
-          <w:sz w:val="22"/>
-          <w:szCs w:val="22"/>
-        </w:rPr>
-        <w:t>LMS Scope of Work</w:t>
-      </w:r>
-      <w:r>
-        <w:rPr>
-          <w:rFonts w:ascii="Calibri" w:eastAsia="Times New Roman" w:hAnsi="Calibri" w:cs="Calibri"/>
-          <w:color w:val="1F2937"/>
-          <w:sz w:val="22"/>
-          <w:szCs w:val="22"/>
-        </w:rPr>
-        <w:t xml:space="preserve"> brought into ManageIT, opened from the LMS tab or the LMS portal card.</w:t>
-      </w:r>
-    </w:p>
-    <w:p>
-      <w:pPr>
-        <w:numPr>
-          <w:ilvl w:val="0"/>
-          <w:numId w:val="1"/>
-        </w:numPr>
-        <w:spacing w:before="100" w:beforeAutospacing="1" w:after="100" w:afterAutospacing="1"/>
-        <w:rPr>
-          <w:rFonts w:ascii="Calibri" w:eastAsia="Times New Roman" w:hAnsi="Calibri" w:cs="Calibri"/>
-          <w:color w:val="1F2937"/>
-          <w:sz w:val="22"/>
-          <w:szCs w:val="22"/>
-        </w:rPr>
-      </w:pPr>
-      <w:r>
-        <w:rPr>
-          <w:rFonts w:ascii="Calibri" w:eastAsia="Times New Roman" w:hAnsi="Calibri" w:cs="Calibri"/>
-          <w:b/>
-          <w:bCs/>
-          <w:color w:val="1F2937"/>
-          <w:sz w:val="22"/>
-          <w:szCs w:val="22"/>
-        </w:rPr>
-        <w:t>Per-user LMS access</w:t>
-      </w:r>
-      <w:r>
-        <w:rPr>
-          <w:rFonts w:ascii="Calibri" w:eastAsia="Times New Roman" w:hAnsi="Calibri" w:cs="Calibri"/>
-          <w:color w:val="1F2937"/>
-          <w:sz w:val="22"/>
-          <w:szCs w:val="22"/>
-        </w:rPr>
-        <w:t xml:space="preserve"> controlled by admin.</w:t>
-      </w:r>
-    </w:p>
-    <w:p>
-      <w:pPr>
-        <w:numPr>
-          <w:ilvl w:val="0"/>
-          <w:numId w:val="1"/>
-        </w:numPr>
-        <w:spacing w:before="100" w:beforeAutospacing="1" w:after="100" w:afterAutospacing="1"/>
-        <w:rPr>
-          <w:rFonts w:ascii="Calibri" w:eastAsia="Times New Roman" w:hAnsi="Calibri" w:cs="Calibri"/>
-          <w:color w:val="1F2937"/>
-          <w:sz w:val="22"/>
-          <w:szCs w:val="22"/>
-        </w:rPr>
-      </w:pPr>
-      <w:r>
-        <w:rPr>
-          <w:rFonts w:ascii="Calibri" w:eastAsia="Times New Roman" w:hAnsi="Calibri" w:cs="Calibri"/>
-          <w:b/>
-          <w:bCs/>
-          <w:color w:val="1F2937"/>
-          <w:sz w:val="22"/>
-          <w:szCs w:val="22"/>
-        </w:rPr>
-        <w:t>Asset Lifecycle</w:t>
-      </w:r>
-      <w:r>
-        <w:rPr>
-          <w:rFonts w:ascii="Calibri" w:eastAsia="Times New Roman" w:hAnsi="Calibri" w:cs="Calibri"/>
-          <w:color w:val="1F2937"/>
-          <w:sz w:val="22"/>
-          <w:szCs w:val="22"/>
-        </w:rPr>
-        <w:t xml:space="preserve"> in LMS: standard equipment, BOM, lifecycle and equipment groups.</w:t>
-      </w:r>
-    </w:p>
-    <w:p>
-      <w:pPr>
-        <w:numPr>
-          <w:ilvl w:val="0"/>
-          <w:numId w:val="1"/>
-        </w:numPr>
-        <w:spacing w:before="100" w:beforeAutospacing="1" w:after="100" w:afterAutospacing="1"/>
-        <w:rPr>
-          <w:rFonts w:ascii="Calibri" w:eastAsia="Times New Roman" w:hAnsi="Calibri" w:cs="Calibri"/>
-          <w:color w:val="1F2937"/>
-          <w:sz w:val="22"/>
-          <w:szCs w:val="22"/>
-        </w:rPr>
-      </w:pPr>
-      <w:r>
-        <w:rPr>
-          <w:rFonts w:ascii="Calibri" w:eastAsia="Times New Roman" w:hAnsi="Calibri" w:cs="Calibri"/>
-          <w:b/>
-          <w:bCs/>
-          <w:color w:val="1F2937"/>
-          <w:sz w:val="22"/>
-          <w:szCs w:val="22"/>
-        </w:rPr>
         <w:t>Online demo link</w:t>
       </w:r>
       <w:r>
@@ -8232,7 +6749,51 @@
           <w:sz w:val="22"/>
           <w:szCs w:val="22"/>
         </w:rPr>
-        <w:t xml:space="preserve"> code on GitHub, a security package updated, old unused job card code removed, LMS installer rebuilt.</w:t>
+        <w:t xml:space="preserve"> </w:t>
+      </w:r>
+      <w:r>
+        <w:rPr>
+          <w:rFonts w:ascii="Calibri" w:eastAsia="Times New Roman" w:hAnsi="Calibri" w:cs="Calibri"/>
+          <w:color w:val="1F2937"/>
+          <w:sz w:val="22"/>
+          <w:szCs w:val="22"/>
+        </w:rPr>
+        <w:t>code on GitHub, a security package updated, and old unused job card code removed.</w:t>
+      </w:r>
+    </w:p>
+    <w:p>
+      <w:pPr>
+        <w:numPr>
+          <w:ilvl w:val="0"/>
+          <w:numId w:val="1"/>
+        </w:numPr>
+        <w:spacing w:before="100" w:beforeAutospacing="1" w:after="100" w:afterAutospacing="1"/>
+        <w:rPr>
+          <w:rFonts w:ascii="Calibri" w:eastAsia="Times New Roman" w:hAnsi="Calibri" w:cs="Calibri"/>
+          <w:color w:val="1F2937"/>
+          <w:sz w:val="22"/>
+          <w:szCs w:val="22"/>
+        </w:rPr>
+      </w:pPr>
+      <w:r>
+        <w:rPr>
+          <w:rFonts w:ascii="Calibri" w:eastAsia="Times New Roman" w:hAnsi="Calibri" w:cs="Calibri"/>
+          <w:b/>
+          <w:bCs/>
+          <w:color w:val="1F2937"/>
+          <w:sz w:val="22"/>
+          <w:szCs w:val="22"/>
+        </w:rPr>
+        <w:t>Bug fix:</w:t>
+      </w:r>
+      <w:r>
+        <w:rPr>
+          <w:rFonts w:ascii="Calibri" w:eastAsia="Times New Roman" w:hAnsi="Calibri" w:cs="Calibri"/>
+          <w:color w:val="1F2937"/>
+          <w:sz w:val="22"/>
+          <w:szCs w:val="22"/>
+        </w:rPr>
+        <w:t xml:space="preserve"> the BOM and Pastel pages now load when opened from the menu (previously they only filled in after an action).</w:t>
       </w:r>
     </w:p>
     <w:p>
@@ -8316,16 +6877,7 @@
           <w:sz w:val="22"/>
           <w:szCs w:val="22"/>
         </w:rPr>
-        <w:t xml:space="preserve"> </w:t>
-      </w:r>
-      <w:r>
-        <w:rPr>
-          <w:rFonts w:ascii="Calibri" w:eastAsia="Times New Roman" w:hAnsi="Calibri" w:cs="Calibri"/>
-          <w:color w:val="1F2937"/>
-          <w:sz w:val="22"/>
-          <w:szCs w:val="22"/>
-        </w:rPr>
-        <w:t>it still runs the version from 19 October.</w:t>
+        <w:t xml:space="preserve"> it still runs the version from 19 October, without the latest fixes.</w:t>
       </w:r>
     </w:p>
     <w:p>
@@ -8363,31 +6915,7 @@
           <w:sz w:val="22"/>
           <w:szCs w:val="22"/>
         </w:rPr>
-        <w:t>A live, shared database (hosting choice, setup, running the new scripts, connecting the online link).</w:t>
-      </w:r>
-    </w:p>
-    <w:p>
-      <w:pPr>
-        <w:numPr>
-          <w:ilvl w:val="0"/>
-          <w:numId w:val="3"/>
-        </w:numPr>
-        <w:spacing w:before="100" w:beforeAutospacing="1" w:after="100" w:afterAutospacing="1"/>
-        <w:rPr>
-          <w:rFonts w:ascii="Calibri" w:eastAsia="Times New Roman" w:hAnsi="Calibri" w:cs="Calibri"/>
-          <w:color w:val="1F2937"/>
-          <w:sz w:val="22"/>
-          <w:szCs w:val="22"/>
-        </w:rPr>
-      </w:pPr>
-      <w:r>
-        <w:rPr>
-          <w:rFonts w:ascii="Calibri" w:eastAsia="Times New Roman" w:hAnsi="Calibri" w:cs="Calibri"/>
-          <w:color w:val="1F2937"/>
-          <w:sz w:val="22"/>
-          <w:szCs w:val="22"/>
-        </w:rPr>
-        <w:t>Moving LMS data, including Asset Lifecycle, into the shared database.</w:t>
+        <w:t>A live, shared database (hosting choice, setup, running the new script, connecting the online link).</w:t>
       </w:r>
     </w:p>
     <w:p>
@@ -8435,54 +6963,6 @@
           <w:sz w:val="22"/>
           <w:szCs w:val="22"/>
         </w:rPr>
-        <w:t>Setting up LMS access for the right users.</w:t>
-      </w:r>
-    </w:p>
-    <w:p>
-      <w:pPr>
-        <w:numPr>
-          <w:ilvl w:val="0"/>
-          <w:numId w:val="3"/>
-        </w:numPr>
-        <w:spacing w:before="100" w:beforeAutospacing="1" w:after="100" w:afterAutospacing="1"/>
-        <w:rPr>
-          <w:rFonts w:ascii="Calibri" w:eastAsia="Times New Roman" w:hAnsi="Calibri" w:cs="Calibri"/>
-          <w:color w:val="1F2937"/>
-          <w:sz w:val="22"/>
-          <w:szCs w:val="22"/>
-        </w:rPr>
-      </w:pPr>
-      <w:r>
-        <w:rPr>
-          <w:rFonts w:ascii="Calibri" w:eastAsia="Times New Roman" w:hAnsi="Calibri" w:cs="Calibri"/>
-          <w:color w:val="1F2937"/>
-          <w:sz w:val="22"/>
-          <w:szCs w:val="22"/>
-        </w:rPr>
-        <w:t>More Asset Lifecycle features (requirements to come).</w:t>
-      </w:r>
-    </w:p>
-    <w:p>
-      <w:pPr>
-        <w:numPr>
-          <w:ilvl w:val="0"/>
-          <w:numId w:val="3"/>
-        </w:numPr>
-        <w:spacing w:before="100" w:beforeAutospacing="1" w:after="100" w:afterAutospacing="1"/>
-        <w:rPr>
-          <w:rFonts w:ascii="Calibri" w:eastAsia="Times New Roman" w:hAnsi="Calibri" w:cs="Calibri"/>
-          <w:color w:val="1F2937"/>
-          <w:sz w:val="22"/>
-          <w:szCs w:val="22"/>
-        </w:rPr>
-      </w:pPr>
-      <w:r>
-        <w:rPr>
-          <w:rFonts w:ascii="Calibri" w:eastAsia="Times New Roman" w:hAnsi="Calibri" w:cs="Calibri"/>
-          <w:color w:val="1F2937"/>
-          <w:sz w:val="22"/>
-          <w:szCs w:val="22"/>
-        </w:rPr>
         <w:t>Replacing the demo passwords before live use.</w:t>
       </w:r>
     </w:p>
@@ -8507,7 +6987,7 @@
           <w:sz w:val="22"/>
           <w:szCs w:val="22"/>
         </w:rPr>
-        <w:t>Rebuilding the LMS app's original source code, which is missing, so it is easier to extend.</w:t>
+        <w:t>Hiding passwords on the user form (they currently show as plain text on screen).</w:t>
       </w:r>
     </w:p>
     <w:p>
@@ -8526,7 +7006,7 @@
           <w:sz w:val="22"/>
           <w:szCs w:val="22"/>
         </w:rPr>
-        <w:pict w14:anchorId="5ED8FBA6">
+        <w:pict w14:anchorId="79D93513">
           <v:rect id="_x0000_i1029" style="width:0;height:1.5pt" o:hralign="center" o:hrstd="t" o:hr="t" fillcolor="#a0a0a0" stroked="f"/>
         </w:pict>
       </w:r>
@@ -9203,7 +7683,7 @@
                 <w:sz w:val="20"/>
                 <w:szCs w:val="20"/>
               </w:rPr>
-              <w:t>Latest changes appear there only after the next redeploy.</w:t>
+              <w:t>Latest changes and fixes appear there only after the next redeploy.</w:t>
             </w:r>
           </w:p>
         </w:tc>
@@ -9283,7 +7763,16 @@
                 <w:sz w:val="20"/>
                 <w:szCs w:val="20"/>
               </w:rPr>
-              <w:t>LMS data is stored per computer.</w:t>
+              <w:t>The new database script has not been run</w:t>
+            </w:r>
+            <w:r>
+              <w:rPr>
+                <w:rFonts w:ascii="Calibri" w:eastAsia="Times New Roman" w:hAnsi="Calibri" w:cs="Calibri"/>
+                <w:color w:val="1F2937"/>
+                <w:sz w:val="20"/>
+                <w:szCs w:val="20"/>
+              </w:rPr>
+              <w:t xml:space="preserve"> (BOM and Pastel storage).</w:t>
             </w:r>
           </w:p>
         </w:tc>
@@ -9321,7 +7810,7 @@
                 <w:sz w:val="20"/>
                 <w:szCs w:val="20"/>
               </w:rPr>
-              <w:t>LMS and Asset Lifecycle data is not shared between users, or between the browser version and the desktop app.</w:t>
+              <w:t>Until it is, these features rely on offline mode.</w:t>
             </w:r>
           </w:p>
         </w:tc>
@@ -9401,7 +7890,7 @@
                 <w:sz w:val="20"/>
                 <w:szCs w:val="20"/>
               </w:rPr>
-              <w:t>The LMS app's original source code is missing.</w:t>
+              <w:t>Passwords show as plain text on the user form.</w:t>
             </w:r>
           </w:p>
         </w:tc>
@@ -9439,7 +7928,7 @@
                 <w:sz w:val="20"/>
                 <w:szCs w:val="20"/>
               </w:rPr>
-              <w:t>New LMS features are added as extra pages next to the existing app. This works, but takes more effort and limits deeper changes.</w:t>
+              <w:t>Anyone looking at the admin's screen can read a user's password.</w:t>
             </w:r>
           </w:p>
         </w:tc>
@@ -9480,251 +7969,6 @@
                 <w:szCs w:val="20"/>
               </w:rPr>
               <w:t>7</w:t>
-            </w:r>
-          </w:p>
-        </w:tc>
-        <w:tc>
-          <w:tcPr>
-            <w:tcW w:w="1667" w:type="pct"/>
-            <w:tcBorders>
-              <w:top w:val="single" w:sz="6" w:space="0" w:color="CBD5E1"/>
-              <w:left w:val="single" w:sz="6" w:space="0" w:color="CBD5E1"/>
-              <w:bottom w:val="single" w:sz="6" w:space="0" w:color="CBD5E1"/>
-              <w:right w:val="single" w:sz="6" w:space="0" w:color="CBD5E1"/>
-            </w:tcBorders>
-            <w:tcMar>
-              <w:top w:w="80" w:type="dxa"/>
-              <w:left w:w="120" w:type="dxa"/>
-              <w:bottom w:w="80" w:type="dxa"/>
-              <w:right w:w="120" w:type="dxa"/>
-            </w:tcMar>
-            <w:hideMark/>
-          </w:tcPr>
-          <w:p>
-            <w:pPr>
-              <w:spacing w:before="120" w:after="200"/>
-              <w:rPr>
-                <w:rFonts w:ascii="Calibri" w:eastAsia="Times New Roman" w:hAnsi="Calibri" w:cs="Calibri"/>
-                <w:color w:val="1F2937"/>
-                <w:sz w:val="20"/>
-                <w:szCs w:val="20"/>
-              </w:rPr>
-            </w:pPr>
-            <w:r>
-              <w:rPr>
-                <w:rFonts w:ascii="Calibri" w:eastAsia="Times New Roman" w:hAnsi="Calibri" w:cs="Calibri"/>
-                <w:b/>
-                <w:bCs/>
-                <w:color w:val="1F2937"/>
-                <w:sz w:val="20"/>
-                <w:szCs w:val="20"/>
-              </w:rPr>
-              <w:t>The new database scripts have not been run</w:t>
-            </w:r>
-            <w:r>
-              <w:rPr>
-                <w:rFonts w:ascii="Calibri" w:eastAsia="Times New Roman" w:hAnsi="Calibri" w:cs="Calibri"/>
-                <w:color w:val="1F2937"/>
-                <w:sz w:val="20"/>
-                <w:szCs w:val="20"/>
-              </w:rPr>
-              <w:t xml:space="preserve"> (BOM/Pastel storage and LMS access).</w:t>
-            </w:r>
-          </w:p>
-        </w:tc>
-        <w:tc>
-          <w:tcPr>
-            <w:tcW w:w="1667" w:type="pct"/>
-            <w:tcBorders>
-              <w:top w:val="single" w:sz="6" w:space="0" w:color="CBD5E1"/>
-              <w:left w:val="single" w:sz="6" w:space="0" w:color="CBD5E1"/>
-              <w:bottom w:val="single" w:sz="6" w:space="0" w:color="CBD5E1"/>
-              <w:right w:val="single" w:sz="6" w:space="0" w:color="CBD5E1"/>
-            </w:tcBorders>
-            <w:tcMar>
-              <w:top w:w="80" w:type="dxa"/>
-              <w:left w:w="120" w:type="dxa"/>
-              <w:bottom w:w="80" w:type="dxa"/>
-              <w:right w:w="120" w:type="dxa"/>
-            </w:tcMar>
-            <w:hideMark/>
-          </w:tcPr>
-          <w:p>
-            <w:pPr>
-              <w:spacing w:before="120" w:after="200"/>
-              <w:rPr>
-                <w:rFonts w:ascii="Calibri" w:eastAsia="Times New Roman" w:hAnsi="Calibri" w:cs="Calibri"/>
-                <w:color w:val="1F2937"/>
-                <w:sz w:val="20"/>
-                <w:szCs w:val="20"/>
-              </w:rPr>
-            </w:pPr>
-            <w:r>
-              <w:rPr>
-                <w:rFonts w:ascii="Calibri" w:eastAsia="Times New Roman" w:hAnsi="Calibri" w:cs="Calibri"/>
-                <w:color w:val="1F2937"/>
-                <w:sz w:val="20"/>
-                <w:szCs w:val="20"/>
-              </w:rPr>
-              <w:t>Until they are, these features rely on offline mode.</w:t>
-            </w:r>
-          </w:p>
-        </w:tc>
-      </w:tr>
-      <w:tr>
-        <w:tc>
-          <w:tcPr>
-            <w:tcW w:w="1667" w:type="pct"/>
-            <w:tcBorders>
-              <w:top w:val="single" w:sz="6" w:space="0" w:color="CBD5E1"/>
-              <w:left w:val="single" w:sz="6" w:space="0" w:color="CBD5E1"/>
-              <w:bottom w:val="single" w:sz="6" w:space="0" w:color="CBD5E1"/>
-              <w:right w:val="single" w:sz="6" w:space="0" w:color="CBD5E1"/>
-            </w:tcBorders>
-            <w:tcMar>
-              <w:top w:w="80" w:type="dxa"/>
-              <w:left w:w="120" w:type="dxa"/>
-              <w:bottom w:w="80" w:type="dxa"/>
-              <w:right w:w="120" w:type="dxa"/>
-            </w:tcMar>
-            <w:hideMark/>
-          </w:tcPr>
-          <w:p>
-            <w:pPr>
-              <w:spacing w:before="120" w:after="200"/>
-              <w:rPr>
-                <w:rFonts w:ascii="Calibri" w:eastAsia="Times New Roman" w:hAnsi="Calibri" w:cs="Calibri"/>
-                <w:color w:val="1F2937"/>
-                <w:sz w:val="20"/>
-                <w:szCs w:val="20"/>
-              </w:rPr>
-            </w:pPr>
-            <w:r>
-              <w:rPr>
-                <w:rFonts w:ascii="Calibri" w:eastAsia="Times New Roman" w:hAnsi="Calibri" w:cs="Calibri"/>
-                <w:color w:val="1F2937"/>
-                <w:sz w:val="20"/>
-                <w:szCs w:val="20"/>
-              </w:rPr>
-              <w:t>8</w:t>
-            </w:r>
-          </w:p>
-        </w:tc>
-        <w:tc>
-          <w:tcPr>
-            <w:tcW w:w="1667" w:type="pct"/>
-            <w:tcBorders>
-              <w:top w:val="single" w:sz="6" w:space="0" w:color="CBD5E1"/>
-              <w:left w:val="single" w:sz="6" w:space="0" w:color="CBD5E1"/>
-              <w:bottom w:val="single" w:sz="6" w:space="0" w:color="CBD5E1"/>
-              <w:right w:val="single" w:sz="6" w:space="0" w:color="CBD5E1"/>
-            </w:tcBorders>
-            <w:tcMar>
-              <w:top w:w="80" w:type="dxa"/>
-              <w:left w:w="120" w:type="dxa"/>
-              <w:bottom w:w="80" w:type="dxa"/>
-              <w:right w:w="120" w:type="dxa"/>
-            </w:tcMar>
-            <w:hideMark/>
-          </w:tcPr>
-          <w:p>
-            <w:pPr>
-              <w:spacing w:before="120" w:after="200"/>
-              <w:rPr>
-                <w:rFonts w:ascii="Calibri" w:eastAsia="Times New Roman" w:hAnsi="Calibri" w:cs="Calibri"/>
-                <w:color w:val="1F2937"/>
-                <w:sz w:val="20"/>
-                <w:szCs w:val="20"/>
-              </w:rPr>
-            </w:pPr>
-            <w:r>
-              <w:rPr>
-                <w:rFonts w:ascii="Calibri" w:eastAsia="Times New Roman" w:hAnsi="Calibri" w:cs="Calibri"/>
-                <w:b/>
-                <w:bCs/>
-                <w:color w:val="1F2937"/>
-                <w:sz w:val="20"/>
-                <w:szCs w:val="20"/>
-              </w:rPr>
-              <w:t>The login page reveals whether a SAL number has LMS access.</w:t>
-            </w:r>
-          </w:p>
-        </w:tc>
-        <w:tc>
-          <w:tcPr>
-            <w:tcW w:w="1667" w:type="pct"/>
-            <w:tcBorders>
-              <w:top w:val="single" w:sz="6" w:space="0" w:color="CBD5E1"/>
-              <w:left w:val="single" w:sz="6" w:space="0" w:color="CBD5E1"/>
-              <w:bottom w:val="single" w:sz="6" w:space="0" w:color="CBD5E1"/>
-              <w:right w:val="single" w:sz="6" w:space="0" w:color="CBD5E1"/>
-            </w:tcBorders>
-            <w:tcMar>
-              <w:top w:w="80" w:type="dxa"/>
-              <w:left w:w="120" w:type="dxa"/>
-              <w:bottom w:w="80" w:type="dxa"/>
-              <w:right w:w="120" w:type="dxa"/>
-            </w:tcMar>
-            <w:hideMark/>
-          </w:tcPr>
-          <w:p>
-            <w:pPr>
-              <w:spacing w:before="120" w:after="200"/>
-              <w:rPr>
-                <w:rFonts w:ascii="Calibri" w:eastAsia="Times New Roman" w:hAnsi="Calibri" w:cs="Calibri"/>
-                <w:color w:val="1F2937"/>
-                <w:sz w:val="20"/>
-                <w:szCs w:val="20"/>
-              </w:rPr>
-            </w:pPr>
-            <w:r>
-              <w:rPr>
-                <w:rFonts w:ascii="Calibri" w:eastAsia="Times New Roman" w:hAnsi="Calibri" w:cs="Calibri"/>
-                <w:color w:val="1F2937"/>
-                <w:sz w:val="20"/>
-                <w:szCs w:val="20"/>
-              </w:rPr>
-              <w:t>Minor: someone could check whether a SAL number exists and has LMS access. Acceptable internally; review before going public.</w:t>
-            </w:r>
-          </w:p>
-        </w:tc>
-      </w:tr>
-      <w:tr>
-        <w:tc>
-          <w:tcPr>
-            <w:tcW w:w="1667" w:type="pct"/>
-            <w:tcBorders>
-              <w:top w:val="single" w:sz="6" w:space="0" w:color="CBD5E1"/>
-              <w:left w:val="single" w:sz="6" w:space="0" w:color="CBD5E1"/>
-              <w:bottom w:val="single" w:sz="6" w:space="0" w:color="CBD5E1"/>
-              <w:right w:val="single" w:sz="6" w:space="0" w:color="CBD5E1"/>
-            </w:tcBorders>
-            <w:tcMar>
-              <w:top w:w="80" w:type="dxa"/>
-              <w:left w:w="120" w:type="dxa"/>
-              <w:bottom w:w="80" w:type="dxa"/>
-              <w:right w:w="120" w:type="dxa"/>
-            </w:tcMar>
-            <w:hideMark/>
-          </w:tcPr>
-          <w:p>
-            <w:pPr>
-              <w:spacing w:before="120" w:after="200"/>
-              <w:rPr>
-                <w:rFonts w:ascii="Calibri" w:eastAsia="Times New Roman" w:hAnsi="Calibri" w:cs="Calibri"/>
-                <w:color w:val="1F2937"/>
-                <w:sz w:val="20"/>
-                <w:szCs w:val="20"/>
-              </w:rPr>
-            </w:pPr>
-            <w:r>
-              <w:rPr>
-                <w:rFonts w:ascii="Calibri" w:eastAsia="Times New Roman" w:hAnsi="Calibri" w:cs="Calibri"/>
-                <w:color w:val="1F2937"/>
-                <w:sz w:val="20"/>
-                <w:szCs w:val="20"/>
-              </w:rPr>
-              <w:t>9</w:t>
             </w:r>
           </w:p>
         </w:tc>
@@ -9824,7 +8068,7 @@
           <w:sz w:val="22"/>
           <w:szCs w:val="22"/>
         </w:rPr>
-        <w:pict w14:anchorId="453AF150">
+        <w:pict w14:anchorId="1CD625B9">
           <v:rect id="_x0000_i1030" style="width:0;height:1.5pt" o:hralign="center" o:hrstd="t" o:hr="t" fillcolor="#a0a0a0" stroked="f"/>
         </w:pict>
       </w:r>
@@ -10118,7 +8362,7 @@
                 <w:sz w:val="20"/>
                 <w:szCs w:val="20"/>
               </w:rPr>
-              <w:t>Blocks shared data, real use, and central LMS data</w:t>
+              <w:t>Blocks shared data and real use</w:t>
             </w:r>
           </w:p>
         </w:tc>
@@ -10396,7 +8640,7 @@
                 <w:sz w:val="20"/>
                 <w:szCs w:val="20"/>
               </w:rPr>
-              <w:t>Who gets LMS access</w:t>
+              <w:t>Pastel alignment sign-off</w:t>
             </w:r>
           </w:p>
         </w:tc>
@@ -10434,7 +8678,7 @@
                 <w:sz w:val="20"/>
                 <w:szCs w:val="20"/>
               </w:rPr>
-              <w:t>Admin</w:t>
+              <w:t>Justin &amp; Carl Henry</w:t>
             </w:r>
           </w:p>
         </w:tc>
@@ -10472,7 +8716,7 @@
                 <w:sz w:val="20"/>
                 <w:szCs w:val="20"/>
               </w:rPr>
-              <w:t>Controls who can see and use LMS</w:t>
+              <w:t>Unlocks the final Pastel update</w:t>
             </w:r>
           </w:p>
         </w:tc>
@@ -10514,7 +8758,7 @@
                 <w:sz w:val="20"/>
                 <w:szCs w:val="20"/>
               </w:rPr>
-              <w:t>Pastel alignment sign-off</w:t>
+              <w:t>Office network access, or a company web address</w:t>
             </w:r>
           </w:p>
         </w:tc>
@@ -10552,7 +8796,7 @@
                 <w:sz w:val="20"/>
                 <w:szCs w:val="20"/>
               </w:rPr>
-              <w:t>Justin &amp; Carl Henry</w:t>
+              <w:t>IT</w:t>
             </w:r>
           </w:p>
         </w:tc>
@@ -10590,361 +8834,7 @@
                 <w:sz w:val="20"/>
                 <w:szCs w:val="20"/>
               </w:rPr>
-              <w:t>Unlocks the final Pastel update</w:t>
-            </w:r>
-          </w:p>
-        </w:tc>
-      </w:tr>
-      <w:tr>
-        <w:tc>
-          <w:tcPr>
-            <w:tcW w:w="1667" w:type="pct"/>
-            <w:tcBorders>
-              <w:top w:val="single" w:sz="6" w:space="0" w:color="CBD5E1"/>
-              <w:left w:val="single" w:sz="6" w:space="0" w:color="CBD5E1"/>
-              <w:bottom w:val="single" w:sz="6" w:space="0" w:color="CBD5E1"/>
-              <w:right w:val="single" w:sz="6" w:space="0" w:color="CBD5E1"/>
-            </w:tcBorders>
-            <w:tcMar>
-              <w:top w:w="80" w:type="dxa"/>
-              <w:left w:w="120" w:type="dxa"/>
-              <w:bottom w:w="80" w:type="dxa"/>
-              <w:right w:w="120" w:type="dxa"/>
-            </w:tcMar>
-            <w:hideMark/>
-          </w:tcPr>
-          <w:p>
-            <w:pPr>
-              <w:spacing w:before="120" w:after="200"/>
-              <w:rPr>
-                <w:rFonts w:ascii="Calibri" w:eastAsia="Times New Roman" w:hAnsi="Calibri" w:cs="Calibri"/>
-                <w:color w:val="1F2937"/>
-                <w:sz w:val="20"/>
-                <w:szCs w:val="20"/>
-              </w:rPr>
-            </w:pPr>
-            <w:r>
-              <w:rPr>
-                <w:rFonts w:ascii="Calibri" w:eastAsia="Times New Roman" w:hAnsi="Calibri" w:cs="Calibri"/>
-                <w:b/>
-                <w:bCs/>
-                <w:color w:val="1F2937"/>
-                <w:sz w:val="20"/>
-                <w:szCs w:val="20"/>
-              </w:rPr>
-              <w:t>Remaining Asset Lifecycle requirements</w:t>
-            </w:r>
-          </w:p>
-        </w:tc>
-        <w:tc>
-          <w:tcPr>
-            <w:tcW w:w="1667" w:type="pct"/>
-            <w:tcBorders>
-              <w:top w:val="single" w:sz="6" w:space="0" w:color="CBD5E1"/>
-              <w:left w:val="single" w:sz="6" w:space="0" w:color="CBD5E1"/>
-              <w:bottom w:val="single" w:sz="6" w:space="0" w:color="CBD5E1"/>
-              <w:right w:val="single" w:sz="6" w:space="0" w:color="CBD5E1"/>
-            </w:tcBorders>
-            <w:tcMar>
-              <w:top w:w="80" w:type="dxa"/>
-              <w:left w:w="120" w:type="dxa"/>
-              <w:bottom w:w="80" w:type="dxa"/>
-              <w:right w:w="120" w:type="dxa"/>
-            </w:tcMar>
-            <w:hideMark/>
-          </w:tcPr>
-          <w:p>
-            <w:pPr>
-              <w:spacing w:before="120" w:after="200"/>
-              <w:rPr>
-                <w:rFonts w:ascii="Calibri" w:eastAsia="Times New Roman" w:hAnsi="Calibri" w:cs="Calibri"/>
-                <w:color w:val="1F2937"/>
-                <w:sz w:val="20"/>
-                <w:szCs w:val="20"/>
-              </w:rPr>
-            </w:pPr>
-            <w:r>
-              <w:rPr>
-                <w:rFonts w:ascii="Calibri" w:eastAsia="Times New Roman" w:hAnsi="Calibri" w:cs="Calibri"/>
-                <w:color w:val="1F2937"/>
-                <w:sz w:val="20"/>
-                <w:szCs w:val="20"/>
-              </w:rPr>
-              <w:t>LMS stakeholders</w:t>
-            </w:r>
-          </w:p>
-        </w:tc>
-        <w:tc>
-          <w:tcPr>
-            <w:tcW w:w="1667" w:type="pct"/>
-            <w:tcBorders>
-              <w:top w:val="single" w:sz="6" w:space="0" w:color="CBD5E1"/>
-              <w:left w:val="single" w:sz="6" w:space="0" w:color="CBD5E1"/>
-              <w:bottom w:val="single" w:sz="6" w:space="0" w:color="CBD5E1"/>
-              <w:right w:val="single" w:sz="6" w:space="0" w:color="CBD5E1"/>
-            </w:tcBorders>
-            <w:tcMar>
-              <w:top w:w="80" w:type="dxa"/>
-              <w:left w:w="120" w:type="dxa"/>
-              <w:bottom w:w="80" w:type="dxa"/>
-              <w:right w:w="120" w:type="dxa"/>
-            </w:tcMar>
-            <w:hideMark/>
-          </w:tcPr>
-          <w:p>
-            <w:pPr>
-              <w:spacing w:before="120" w:after="200"/>
-              <w:rPr>
-                <w:rFonts w:ascii="Calibri" w:eastAsia="Times New Roman" w:hAnsi="Calibri" w:cs="Calibri"/>
-                <w:color w:val="1F2937"/>
-                <w:sz w:val="20"/>
-                <w:szCs w:val="20"/>
-              </w:rPr>
-            </w:pPr>
-            <w:r>
-              <w:rPr>
-                <w:rFonts w:ascii="Calibri" w:eastAsia="Times New Roman" w:hAnsi="Calibri" w:cs="Calibri"/>
-                <w:color w:val="1F2937"/>
-                <w:sz w:val="20"/>
-                <w:szCs w:val="20"/>
-              </w:rPr>
-              <w:t>Defines the next LMS work</w:t>
-            </w:r>
-          </w:p>
-        </w:tc>
-      </w:tr>
-      <w:tr>
-        <w:tc>
-          <w:tcPr>
-            <w:tcW w:w="1667" w:type="pct"/>
-            <w:tcBorders>
-              <w:top w:val="single" w:sz="6" w:space="0" w:color="CBD5E1"/>
-              <w:left w:val="single" w:sz="6" w:space="0" w:color="CBD5E1"/>
-              <w:bottom w:val="single" w:sz="6" w:space="0" w:color="CBD5E1"/>
-              <w:right w:val="single" w:sz="6" w:space="0" w:color="CBD5E1"/>
-            </w:tcBorders>
-            <w:tcMar>
-              <w:top w:w="80" w:type="dxa"/>
-              <w:left w:w="120" w:type="dxa"/>
-              <w:bottom w:w="80" w:type="dxa"/>
-              <w:right w:w="120" w:type="dxa"/>
-            </w:tcMar>
-            <w:hideMark/>
-          </w:tcPr>
-          <w:p>
-            <w:pPr>
-              <w:spacing w:before="120" w:after="200"/>
-              <w:rPr>
-                <w:rFonts w:ascii="Calibri" w:eastAsia="Times New Roman" w:hAnsi="Calibri" w:cs="Calibri"/>
-                <w:color w:val="1F2937"/>
-                <w:sz w:val="20"/>
-                <w:szCs w:val="20"/>
-              </w:rPr>
-            </w:pPr>
-            <w:r>
-              <w:rPr>
-                <w:rFonts w:ascii="Calibri" w:eastAsia="Times New Roman" w:hAnsi="Calibri" w:cs="Calibri"/>
-                <w:b/>
-                <w:bCs/>
-                <w:color w:val="1F2937"/>
-                <w:sz w:val="20"/>
-                <w:szCs w:val="20"/>
-              </w:rPr>
-              <w:t>Office network access, or a company web address</w:t>
-            </w:r>
-          </w:p>
-        </w:tc>
-        <w:tc>
-          <w:tcPr>
-            <w:tcW w:w="1667" w:type="pct"/>
-            <w:tcBorders>
-              <w:top w:val="single" w:sz="6" w:space="0" w:color="CBD5E1"/>
-              <w:left w:val="single" w:sz="6" w:space="0" w:color="CBD5E1"/>
-              <w:bottom w:val="single" w:sz="6" w:space="0" w:color="CBD5E1"/>
-              <w:right w:val="single" w:sz="6" w:space="0" w:color="CBD5E1"/>
-            </w:tcBorders>
-            <w:tcMar>
-              <w:top w:w="80" w:type="dxa"/>
-              <w:left w:w="120" w:type="dxa"/>
-              <w:bottom w:w="80" w:type="dxa"/>
-              <w:right w:w="120" w:type="dxa"/>
-            </w:tcMar>
-            <w:hideMark/>
-          </w:tcPr>
-          <w:p>
-            <w:pPr>
-              <w:spacing w:before="120" w:after="200"/>
-              <w:rPr>
-                <w:rFonts w:ascii="Calibri" w:eastAsia="Times New Roman" w:hAnsi="Calibri" w:cs="Calibri"/>
-                <w:color w:val="1F2937"/>
-                <w:sz w:val="20"/>
-                <w:szCs w:val="20"/>
-              </w:rPr>
-            </w:pPr>
-            <w:r>
-              <w:rPr>
-                <w:rFonts w:ascii="Calibri" w:eastAsia="Times New Roman" w:hAnsi="Calibri" w:cs="Calibri"/>
-                <w:color w:val="1F2937"/>
-                <w:sz w:val="20"/>
-                <w:szCs w:val="20"/>
-              </w:rPr>
-              <w:t>IT</w:t>
-            </w:r>
-          </w:p>
-        </w:tc>
-        <w:tc>
-          <w:tcPr>
-            <w:tcW w:w="1667" w:type="pct"/>
-            <w:tcBorders>
-              <w:top w:val="single" w:sz="6" w:space="0" w:color="CBD5E1"/>
-              <w:left w:val="single" w:sz="6" w:space="0" w:color="CBD5E1"/>
-              <w:bottom w:val="single" w:sz="6" w:space="0" w:color="CBD5E1"/>
-              <w:right w:val="single" w:sz="6" w:space="0" w:color="CBD5E1"/>
-            </w:tcBorders>
-            <w:tcMar>
-              <w:top w:w="80" w:type="dxa"/>
-              <w:left w:w="120" w:type="dxa"/>
-              <w:bottom w:w="80" w:type="dxa"/>
-              <w:right w:w="120" w:type="dxa"/>
-            </w:tcMar>
-            <w:hideMark/>
-          </w:tcPr>
-          <w:p>
-            <w:pPr>
-              <w:spacing w:before="120" w:after="200"/>
-              <w:rPr>
-                <w:rFonts w:ascii="Calibri" w:eastAsia="Times New Roman" w:hAnsi="Calibri" w:cs="Calibri"/>
-                <w:color w:val="1F2937"/>
-                <w:sz w:val="20"/>
-                <w:szCs w:val="20"/>
-              </w:rPr>
-            </w:pPr>
-            <w:r>
-              <w:rPr>
-                <w:rFonts w:ascii="Calibri" w:eastAsia="Times New Roman" w:hAnsi="Calibri" w:cs="Calibri"/>
-                <w:color w:val="1F2937"/>
-                <w:sz w:val="20"/>
-                <w:szCs w:val="20"/>
-              </w:rPr>
               <w:t>Makes the online link usable in the office</w:t>
-            </w:r>
-          </w:p>
-        </w:tc>
-      </w:tr>
-      <w:tr>
-        <w:tc>
-          <w:tcPr>
-            <w:tcW w:w="1667" w:type="pct"/>
-            <w:tcBorders>
-              <w:top w:val="single" w:sz="6" w:space="0" w:color="CBD5E1"/>
-              <w:left w:val="single" w:sz="6" w:space="0" w:color="CBD5E1"/>
-              <w:bottom w:val="single" w:sz="6" w:space="0" w:color="CBD5E1"/>
-              <w:right w:val="single" w:sz="6" w:space="0" w:color="CBD5E1"/>
-            </w:tcBorders>
-            <w:tcMar>
-              <w:top w:w="80" w:type="dxa"/>
-              <w:left w:w="120" w:type="dxa"/>
-              <w:bottom w:w="80" w:type="dxa"/>
-              <w:right w:w="120" w:type="dxa"/>
-            </w:tcMar>
-            <w:hideMark/>
-          </w:tcPr>
-          <w:p>
-            <w:pPr>
-              <w:spacing w:before="120" w:after="200"/>
-              <w:rPr>
-                <w:rFonts w:ascii="Calibri" w:eastAsia="Times New Roman" w:hAnsi="Calibri" w:cs="Calibri"/>
-                <w:color w:val="1F2937"/>
-                <w:sz w:val="20"/>
-                <w:szCs w:val="20"/>
-              </w:rPr>
-            </w:pPr>
-            <w:r>
-              <w:rPr>
-                <w:rFonts w:ascii="Calibri" w:eastAsia="Times New Roman" w:hAnsi="Calibri" w:cs="Calibri"/>
-                <w:b/>
-                <w:bCs/>
-                <w:color w:val="1F2937"/>
-                <w:sz w:val="20"/>
-                <w:szCs w:val="20"/>
-              </w:rPr>
-              <w:t>Whether to rebuild the LMS source code</w:t>
-            </w:r>
-          </w:p>
-        </w:tc>
-        <w:tc>
-          <w:tcPr>
-            <w:tcW w:w="1667" w:type="pct"/>
-            <w:tcBorders>
-              <w:top w:val="single" w:sz="6" w:space="0" w:color="CBD5E1"/>
-              <w:left w:val="single" w:sz="6" w:space="0" w:color="CBD5E1"/>
-              <w:bottom w:val="single" w:sz="6" w:space="0" w:color="CBD5E1"/>
-              <w:right w:val="single" w:sz="6" w:space="0" w:color="CBD5E1"/>
-            </w:tcBorders>
-            <w:tcMar>
-              <w:top w:w="80" w:type="dxa"/>
-              <w:left w:w="120" w:type="dxa"/>
-              <w:bottom w:w="80" w:type="dxa"/>
-              <w:right w:w="120" w:type="dxa"/>
-            </w:tcMar>
-            <w:hideMark/>
-          </w:tcPr>
-          <w:p>
-            <w:pPr>
-              <w:spacing w:before="120" w:after="200"/>
-              <w:rPr>
-                <w:rFonts w:ascii="Calibri" w:eastAsia="Times New Roman" w:hAnsi="Calibri" w:cs="Calibri"/>
-                <w:color w:val="1F2937"/>
-                <w:sz w:val="20"/>
-                <w:szCs w:val="20"/>
-              </w:rPr>
-            </w:pPr>
-            <w:r>
-              <w:rPr>
-                <w:rFonts w:ascii="Calibri" w:eastAsia="Times New Roman" w:hAnsi="Calibri" w:cs="Calibri"/>
-                <w:color w:val="1F2937"/>
-                <w:sz w:val="20"/>
-                <w:szCs w:val="20"/>
-              </w:rPr>
-              <w:t>Management</w:t>
-            </w:r>
-          </w:p>
-        </w:tc>
-        <w:tc>
-          <w:tcPr>
-            <w:tcW w:w="1667" w:type="pct"/>
-            <w:tcBorders>
-              <w:top w:val="single" w:sz="6" w:space="0" w:color="CBD5E1"/>
-              <w:left w:val="single" w:sz="6" w:space="0" w:color="CBD5E1"/>
-              <w:bottom w:val="single" w:sz="6" w:space="0" w:color="CBD5E1"/>
-              <w:right w:val="single" w:sz="6" w:space="0" w:color="CBD5E1"/>
-            </w:tcBorders>
-            <w:tcMar>
-              <w:top w:w="80" w:type="dxa"/>
-              <w:left w:w="120" w:type="dxa"/>
-              <w:bottom w:w="80" w:type="dxa"/>
-              <w:right w:w="120" w:type="dxa"/>
-            </w:tcMar>
-            <w:hideMark/>
-          </w:tcPr>
-          <w:p>
-            <w:pPr>
-              <w:spacing w:before="120" w:after="200"/>
-              <w:rPr>
-                <w:rFonts w:ascii="Calibri" w:eastAsia="Times New Roman" w:hAnsi="Calibri" w:cs="Calibri"/>
-                <w:color w:val="1F2937"/>
-                <w:sz w:val="20"/>
-                <w:szCs w:val="20"/>
-              </w:rPr>
-            </w:pPr>
-            <w:r>
-              <w:rPr>
-                <w:rFonts w:ascii="Calibri" w:eastAsia="Times New Roman" w:hAnsi="Calibri" w:cs="Calibri"/>
-                <w:color w:val="1F2937"/>
-                <w:sz w:val="20"/>
-                <w:szCs w:val="20"/>
-              </w:rPr>
-              <w:t>Larger effort; makes future LMS changes easier</w:t>
             </w:r>
           </w:p>
         </w:tc>
@@ -10966,7 +8856,7 @@
           <w:sz w:val="22"/>
           <w:szCs w:val="22"/>
         </w:rPr>
-        <w:pict w14:anchorId="01485405">
+        <w:pict w14:anchorId="5E71DB95">
           <v:rect id="_x0000_i1031" style="width:0;height:1.5pt" o:hralign="center" o:hrstd="t" o:hr="t" fillcolor="#a0a0a0" stroked="f"/>
         </w:pict>
       </w:r>
@@ -11213,7 +9103,7 @@
                 <w:sz w:val="20"/>
                 <w:szCs w:val="20"/>
               </w:rPr>
-              <w:t>Decide on and set up the live database; run the new scripts; connect the app</w:t>
+              <w:t>Decide on and set up the live database; run the new script; connect the app</w:t>
             </w:r>
           </w:p>
         </w:tc>
@@ -11331,7 +9221,7 @@
                 <w:sz w:val="20"/>
                 <w:szCs w:val="20"/>
               </w:rPr>
-              <w:t>Replace the demo passwords and agree a password approach</w:t>
+              <w:t>Replace the demo passwords, hide passwords on screen, and agree a password approach</w:t>
             </w:r>
           </w:p>
         </w:tc>
@@ -11921,7 +9811,7 @@
                 <w:sz w:val="20"/>
                 <w:szCs w:val="20"/>
               </w:rPr>
-              <w:t>Move LMS and Asset Lifecycle data into the shared database</w:t>
+              <w:t>Fix office access to the online link</w:t>
             </w:r>
           </w:p>
         </w:tc>
@@ -11959,479 +9849,7 @@
                 <w:sz w:val="20"/>
                 <w:szCs w:val="20"/>
               </w:rPr>
-              <w:t>Lets LMS users share data</w:t>
-            </w:r>
-          </w:p>
-        </w:tc>
-      </w:tr>
-      <w:tr>
-        <w:tc>
-          <w:tcPr>
-            <w:tcW w:w="1667" w:type="pct"/>
-            <w:tcBorders>
-              <w:top w:val="single" w:sz="6" w:space="0" w:color="CBD5E1"/>
-              <w:left w:val="single" w:sz="6" w:space="0" w:color="CBD5E1"/>
-              <w:bottom w:val="single" w:sz="6" w:space="0" w:color="CBD5E1"/>
-              <w:right w:val="single" w:sz="6" w:space="0" w:color="CBD5E1"/>
-            </w:tcBorders>
-            <w:tcMar>
-              <w:top w:w="80" w:type="dxa"/>
-              <w:left w:w="120" w:type="dxa"/>
-              <w:bottom w:w="80" w:type="dxa"/>
-              <w:right w:w="120" w:type="dxa"/>
-            </w:tcMar>
-            <w:hideMark/>
-          </w:tcPr>
-          <w:p>
-            <w:pPr>
-              <w:spacing w:before="120" w:after="200"/>
-              <w:rPr>
-                <w:rFonts w:ascii="Calibri" w:eastAsia="Times New Roman" w:hAnsi="Calibri" w:cs="Calibri"/>
-                <w:color w:val="1F2937"/>
-                <w:sz w:val="20"/>
-                <w:szCs w:val="20"/>
-              </w:rPr>
-            </w:pPr>
-            <w:r>
-              <w:rPr>
-                <w:rFonts w:ascii="Calibri" w:eastAsia="Times New Roman" w:hAnsi="Calibri" w:cs="Calibri"/>
-                <w:b/>
-                <w:bCs/>
-                <w:color w:val="1F2937"/>
-                <w:sz w:val="20"/>
-                <w:szCs w:val="20"/>
-              </w:rPr>
-              <w:t>3 – Medium</w:t>
-            </w:r>
-          </w:p>
-        </w:tc>
-        <w:tc>
-          <w:tcPr>
-            <w:tcW w:w="1667" w:type="pct"/>
-            <w:tcBorders>
-              <w:top w:val="single" w:sz="6" w:space="0" w:color="CBD5E1"/>
-              <w:left w:val="single" w:sz="6" w:space="0" w:color="CBD5E1"/>
-              <w:bottom w:val="single" w:sz="6" w:space="0" w:color="CBD5E1"/>
-              <w:right w:val="single" w:sz="6" w:space="0" w:color="CBD5E1"/>
-            </w:tcBorders>
-            <w:tcMar>
-              <w:top w:w="80" w:type="dxa"/>
-              <w:left w:w="120" w:type="dxa"/>
-              <w:bottom w:w="80" w:type="dxa"/>
-              <w:right w:w="120" w:type="dxa"/>
-            </w:tcMar>
-            <w:hideMark/>
-          </w:tcPr>
-          <w:p>
-            <w:pPr>
-              <w:spacing w:before="120" w:after="200"/>
-              <w:rPr>
-                <w:rFonts w:ascii="Calibri" w:eastAsia="Times New Roman" w:hAnsi="Calibri" w:cs="Calibri"/>
-                <w:color w:val="1F2937"/>
-                <w:sz w:val="20"/>
-                <w:szCs w:val="20"/>
-              </w:rPr>
-            </w:pPr>
-            <w:r>
-              <w:rPr>
-                <w:rFonts w:ascii="Calibri" w:eastAsia="Times New Roman" w:hAnsi="Calibri" w:cs="Calibri"/>
-                <w:color w:val="1F2937"/>
-                <w:sz w:val="20"/>
-                <w:szCs w:val="20"/>
-              </w:rPr>
-              <w:t>Set up LMS access for the right users</w:t>
-            </w:r>
-          </w:p>
-        </w:tc>
-        <w:tc>
-          <w:tcPr>
-            <w:tcW w:w="1667" w:type="pct"/>
-            <w:tcBorders>
-              <w:top w:val="single" w:sz="6" w:space="0" w:color="CBD5E1"/>
-              <w:left w:val="single" w:sz="6" w:space="0" w:color="CBD5E1"/>
-              <w:bottom w:val="single" w:sz="6" w:space="0" w:color="CBD5E1"/>
-              <w:right w:val="single" w:sz="6" w:space="0" w:color="CBD5E1"/>
-            </w:tcBorders>
-            <w:tcMar>
-              <w:top w:w="80" w:type="dxa"/>
-              <w:left w:w="120" w:type="dxa"/>
-              <w:bottom w:w="80" w:type="dxa"/>
-              <w:right w:w="120" w:type="dxa"/>
-            </w:tcMar>
-            <w:hideMark/>
-          </w:tcPr>
-          <w:p>
-            <w:pPr>
-              <w:spacing w:before="120" w:after="200"/>
-              <w:rPr>
-                <w:rFonts w:ascii="Calibri" w:eastAsia="Times New Roman" w:hAnsi="Calibri" w:cs="Calibri"/>
-                <w:color w:val="1F2937"/>
-                <w:sz w:val="20"/>
-                <w:szCs w:val="20"/>
-              </w:rPr>
-            </w:pPr>
-            <w:r>
-              <w:rPr>
-                <w:rFonts w:ascii="Calibri" w:eastAsia="Times New Roman" w:hAnsi="Calibri" w:cs="Calibri"/>
-                <w:color w:val="1F2937"/>
-                <w:sz w:val="20"/>
-                <w:szCs w:val="20"/>
-              </w:rPr>
-              <w:t>Quick once the user list is agreed</w:t>
-            </w:r>
-          </w:p>
-        </w:tc>
-      </w:tr>
-      <w:tr>
-        <w:tc>
-          <w:tcPr>
-            <w:tcW w:w="1667" w:type="pct"/>
-            <w:tcBorders>
-              <w:top w:val="single" w:sz="6" w:space="0" w:color="CBD5E1"/>
-              <w:left w:val="single" w:sz="6" w:space="0" w:color="CBD5E1"/>
-              <w:bottom w:val="single" w:sz="6" w:space="0" w:color="CBD5E1"/>
-              <w:right w:val="single" w:sz="6" w:space="0" w:color="CBD5E1"/>
-            </w:tcBorders>
-            <w:tcMar>
-              <w:top w:w="80" w:type="dxa"/>
-              <w:left w:w="120" w:type="dxa"/>
-              <w:bottom w:w="80" w:type="dxa"/>
-              <w:right w:w="120" w:type="dxa"/>
-            </w:tcMar>
-            <w:hideMark/>
-          </w:tcPr>
-          <w:p>
-            <w:pPr>
-              <w:spacing w:before="120" w:after="200"/>
-              <w:rPr>
-                <w:rFonts w:ascii="Calibri" w:eastAsia="Times New Roman" w:hAnsi="Calibri" w:cs="Calibri"/>
-                <w:color w:val="1F2937"/>
-                <w:sz w:val="20"/>
-                <w:szCs w:val="20"/>
-              </w:rPr>
-            </w:pPr>
-            <w:r>
-              <w:rPr>
-                <w:rFonts w:ascii="Calibri" w:eastAsia="Times New Roman" w:hAnsi="Calibri" w:cs="Calibri"/>
-                <w:b/>
-                <w:bCs/>
-                <w:color w:val="1F2937"/>
-                <w:sz w:val="20"/>
-                <w:szCs w:val="20"/>
-              </w:rPr>
-              <w:t>3 – Medium</w:t>
-            </w:r>
-          </w:p>
-        </w:tc>
-        <w:tc>
-          <w:tcPr>
-            <w:tcW w:w="1667" w:type="pct"/>
-            <w:tcBorders>
-              <w:top w:val="single" w:sz="6" w:space="0" w:color="CBD5E1"/>
-              <w:left w:val="single" w:sz="6" w:space="0" w:color="CBD5E1"/>
-              <w:bottom w:val="single" w:sz="6" w:space="0" w:color="CBD5E1"/>
-              <w:right w:val="single" w:sz="6" w:space="0" w:color="CBD5E1"/>
-            </w:tcBorders>
-            <w:tcMar>
-              <w:top w:w="80" w:type="dxa"/>
-              <w:left w:w="120" w:type="dxa"/>
-              <w:bottom w:w="80" w:type="dxa"/>
-              <w:right w:w="120" w:type="dxa"/>
-            </w:tcMar>
-            <w:hideMark/>
-          </w:tcPr>
-          <w:p>
-            <w:pPr>
-              <w:spacing w:before="120" w:after="200"/>
-              <w:rPr>
-                <w:rFonts w:ascii="Calibri" w:eastAsia="Times New Roman" w:hAnsi="Calibri" w:cs="Calibri"/>
-                <w:color w:val="1F2937"/>
-                <w:sz w:val="20"/>
-                <w:szCs w:val="20"/>
-              </w:rPr>
-            </w:pPr>
-            <w:r>
-              <w:rPr>
-                <w:rFonts w:ascii="Calibri" w:eastAsia="Times New Roman" w:hAnsi="Calibri" w:cs="Calibri"/>
-                <w:color w:val="1F2937"/>
-                <w:sz w:val="20"/>
-                <w:szCs w:val="20"/>
-              </w:rPr>
-              <w:t>Fix office access to the online link</w:t>
-            </w:r>
-          </w:p>
-        </w:tc>
-        <w:tc>
-          <w:tcPr>
-            <w:tcW w:w="1667" w:type="pct"/>
-            <w:tcBorders>
-              <w:top w:val="single" w:sz="6" w:space="0" w:color="CBD5E1"/>
-              <w:left w:val="single" w:sz="6" w:space="0" w:color="CBD5E1"/>
-              <w:bottom w:val="single" w:sz="6" w:space="0" w:color="CBD5E1"/>
-              <w:right w:val="single" w:sz="6" w:space="0" w:color="CBD5E1"/>
-            </w:tcBorders>
-            <w:tcMar>
-              <w:top w:w="80" w:type="dxa"/>
-              <w:left w:w="120" w:type="dxa"/>
-              <w:bottom w:w="80" w:type="dxa"/>
-              <w:right w:w="120" w:type="dxa"/>
-            </w:tcMar>
-            <w:hideMark/>
-          </w:tcPr>
-          <w:p>
-            <w:pPr>
-              <w:spacing w:before="120" w:after="200"/>
-              <w:rPr>
-                <w:rFonts w:ascii="Calibri" w:eastAsia="Times New Roman" w:hAnsi="Calibri" w:cs="Calibri"/>
-                <w:color w:val="1F2937"/>
-                <w:sz w:val="20"/>
-                <w:szCs w:val="20"/>
-              </w:rPr>
-            </w:pPr>
-            <w:r>
-              <w:rPr>
-                <w:rFonts w:ascii="Calibri" w:eastAsia="Times New Roman" w:hAnsi="Calibri" w:cs="Calibri"/>
-                <w:color w:val="1F2937"/>
-                <w:sz w:val="20"/>
-                <w:szCs w:val="20"/>
-              </w:rPr>
               <w:t>Makes it usable on site</w:t>
-            </w:r>
-          </w:p>
-        </w:tc>
-      </w:tr>
-      <w:tr>
-        <w:tc>
-          <w:tcPr>
-            <w:tcW w:w="1667" w:type="pct"/>
-            <w:tcBorders>
-              <w:top w:val="single" w:sz="6" w:space="0" w:color="CBD5E1"/>
-              <w:left w:val="single" w:sz="6" w:space="0" w:color="CBD5E1"/>
-              <w:bottom w:val="single" w:sz="6" w:space="0" w:color="CBD5E1"/>
-              <w:right w:val="single" w:sz="6" w:space="0" w:color="CBD5E1"/>
-            </w:tcBorders>
-            <w:tcMar>
-              <w:top w:w="80" w:type="dxa"/>
-              <w:left w:w="120" w:type="dxa"/>
-              <w:bottom w:w="80" w:type="dxa"/>
-              <w:right w:w="120" w:type="dxa"/>
-            </w:tcMar>
-            <w:hideMark/>
-          </w:tcPr>
-          <w:p>
-            <w:pPr>
-              <w:spacing w:before="120" w:after="200"/>
-              <w:rPr>
-                <w:rFonts w:ascii="Calibri" w:eastAsia="Times New Roman" w:hAnsi="Calibri" w:cs="Calibri"/>
-                <w:color w:val="1F2937"/>
-                <w:sz w:val="20"/>
-                <w:szCs w:val="20"/>
-              </w:rPr>
-            </w:pPr>
-            <w:r>
-              <w:rPr>
-                <w:rFonts w:ascii="Calibri" w:eastAsia="Times New Roman" w:hAnsi="Calibri" w:cs="Calibri"/>
-                <w:b/>
-                <w:bCs/>
-                <w:color w:val="1F2937"/>
-                <w:sz w:val="20"/>
-                <w:szCs w:val="20"/>
-              </w:rPr>
-              <w:t>4 – Later</w:t>
-            </w:r>
-          </w:p>
-        </w:tc>
-        <w:tc>
-          <w:tcPr>
-            <w:tcW w:w="1667" w:type="pct"/>
-            <w:tcBorders>
-              <w:top w:val="single" w:sz="6" w:space="0" w:color="CBD5E1"/>
-              <w:left w:val="single" w:sz="6" w:space="0" w:color="CBD5E1"/>
-              <w:bottom w:val="single" w:sz="6" w:space="0" w:color="CBD5E1"/>
-              <w:right w:val="single" w:sz="6" w:space="0" w:color="CBD5E1"/>
-            </w:tcBorders>
-            <w:tcMar>
-              <w:top w:w="80" w:type="dxa"/>
-              <w:left w:w="120" w:type="dxa"/>
-              <w:bottom w:w="80" w:type="dxa"/>
-              <w:right w:w="120" w:type="dxa"/>
-            </w:tcMar>
-            <w:hideMark/>
-          </w:tcPr>
-          <w:p>
-            <w:pPr>
-              <w:spacing w:before="120" w:after="200"/>
-              <w:rPr>
-                <w:rFonts w:ascii="Calibri" w:eastAsia="Times New Roman" w:hAnsi="Calibri" w:cs="Calibri"/>
-                <w:color w:val="1F2937"/>
-                <w:sz w:val="20"/>
-                <w:szCs w:val="20"/>
-              </w:rPr>
-            </w:pPr>
-            <w:r>
-              <w:rPr>
-                <w:rFonts w:ascii="Calibri" w:eastAsia="Times New Roman" w:hAnsi="Calibri" w:cs="Calibri"/>
-                <w:color w:val="1F2937"/>
-                <w:sz w:val="20"/>
-                <w:szCs w:val="20"/>
-              </w:rPr>
-              <w:t>More Asset Lifecycle features</w:t>
-            </w:r>
-          </w:p>
-        </w:tc>
-        <w:tc>
-          <w:tcPr>
-            <w:tcW w:w="1667" w:type="pct"/>
-            <w:tcBorders>
-              <w:top w:val="single" w:sz="6" w:space="0" w:color="CBD5E1"/>
-              <w:left w:val="single" w:sz="6" w:space="0" w:color="CBD5E1"/>
-              <w:bottom w:val="single" w:sz="6" w:space="0" w:color="CBD5E1"/>
-              <w:right w:val="single" w:sz="6" w:space="0" w:color="CBD5E1"/>
-            </w:tcBorders>
-            <w:tcMar>
-              <w:top w:w="80" w:type="dxa"/>
-              <w:left w:w="120" w:type="dxa"/>
-              <w:bottom w:w="80" w:type="dxa"/>
-              <w:right w:w="120" w:type="dxa"/>
-            </w:tcMar>
-            <w:hideMark/>
-          </w:tcPr>
-          <w:p>
-            <w:pPr>
-              <w:spacing w:before="120" w:after="200"/>
-              <w:rPr>
-                <w:rFonts w:ascii="Calibri" w:eastAsia="Times New Roman" w:hAnsi="Calibri" w:cs="Calibri"/>
-                <w:color w:val="1F2937"/>
-                <w:sz w:val="20"/>
-                <w:szCs w:val="20"/>
-              </w:rPr>
-            </w:pPr>
-            <w:r>
-              <w:rPr>
-                <w:rFonts w:ascii="Calibri" w:eastAsia="Times New Roman" w:hAnsi="Calibri" w:cs="Calibri"/>
-                <w:color w:val="1F2937"/>
-                <w:sz w:val="20"/>
-                <w:szCs w:val="20"/>
-              </w:rPr>
-              <w:t>Waiting on requirements</w:t>
-            </w:r>
-          </w:p>
-        </w:tc>
-      </w:tr>
-      <w:tr>
-        <w:tc>
-          <w:tcPr>
-            <w:tcW w:w="1667" w:type="pct"/>
-            <w:tcBorders>
-              <w:top w:val="single" w:sz="6" w:space="0" w:color="CBD5E1"/>
-              <w:left w:val="single" w:sz="6" w:space="0" w:color="CBD5E1"/>
-              <w:bottom w:val="single" w:sz="6" w:space="0" w:color="CBD5E1"/>
-              <w:right w:val="single" w:sz="6" w:space="0" w:color="CBD5E1"/>
-            </w:tcBorders>
-            <w:tcMar>
-              <w:top w:w="80" w:type="dxa"/>
-              <w:left w:w="120" w:type="dxa"/>
-              <w:bottom w:w="80" w:type="dxa"/>
-              <w:right w:w="120" w:type="dxa"/>
-            </w:tcMar>
-            <w:hideMark/>
-          </w:tcPr>
-          <w:p>
-            <w:pPr>
-              <w:spacing w:before="120" w:after="200"/>
-              <w:rPr>
-                <w:rFonts w:ascii="Calibri" w:eastAsia="Times New Roman" w:hAnsi="Calibri" w:cs="Calibri"/>
-                <w:color w:val="1F2937"/>
-                <w:sz w:val="20"/>
-                <w:szCs w:val="20"/>
-              </w:rPr>
-            </w:pPr>
-            <w:r>
-              <w:rPr>
-                <w:rFonts w:ascii="Calibri" w:eastAsia="Times New Roman" w:hAnsi="Calibri" w:cs="Calibri"/>
-                <w:b/>
-                <w:bCs/>
-                <w:color w:val="1F2937"/>
-                <w:sz w:val="20"/>
-                <w:szCs w:val="20"/>
-              </w:rPr>
-              <w:t>4 – Later</w:t>
-            </w:r>
-          </w:p>
-        </w:tc>
-        <w:tc>
-          <w:tcPr>
-            <w:tcW w:w="1667" w:type="pct"/>
-            <w:tcBorders>
-              <w:top w:val="single" w:sz="6" w:space="0" w:color="CBD5E1"/>
-              <w:left w:val="single" w:sz="6" w:space="0" w:color="CBD5E1"/>
-              <w:bottom w:val="single" w:sz="6" w:space="0" w:color="CBD5E1"/>
-              <w:right w:val="single" w:sz="6" w:space="0" w:color="CBD5E1"/>
-            </w:tcBorders>
-            <w:tcMar>
-              <w:top w:w="80" w:type="dxa"/>
-              <w:left w:w="120" w:type="dxa"/>
-              <w:bottom w:w="80" w:type="dxa"/>
-              <w:right w:w="120" w:type="dxa"/>
-            </w:tcMar>
-            <w:hideMark/>
-          </w:tcPr>
-          <w:p>
-            <w:pPr>
-              <w:spacing w:before="120" w:after="200"/>
-              <w:rPr>
-                <w:rFonts w:ascii="Calibri" w:eastAsia="Times New Roman" w:hAnsi="Calibri" w:cs="Calibri"/>
-                <w:color w:val="1F2937"/>
-                <w:sz w:val="20"/>
-                <w:szCs w:val="20"/>
-              </w:rPr>
-            </w:pPr>
-            <w:r>
-              <w:rPr>
-                <w:rFonts w:ascii="Calibri" w:eastAsia="Times New Roman" w:hAnsi="Calibri" w:cs="Calibri"/>
-                <w:color w:val="1F2937"/>
-                <w:sz w:val="20"/>
-                <w:szCs w:val="20"/>
-              </w:rPr>
-              <w:t>Rebuild the LMS source code</w:t>
-            </w:r>
-          </w:p>
-        </w:tc>
-        <w:tc>
-          <w:tcPr>
-            <w:tcW w:w="1667" w:type="pct"/>
-            <w:tcBorders>
-              <w:top w:val="single" w:sz="6" w:space="0" w:color="CBD5E1"/>
-              <w:left w:val="single" w:sz="6" w:space="0" w:color="CBD5E1"/>
-              <w:bottom w:val="single" w:sz="6" w:space="0" w:color="CBD5E1"/>
-              <w:right w:val="single" w:sz="6" w:space="0" w:color="CBD5E1"/>
-            </w:tcBorders>
-            <w:tcMar>
-              <w:top w:w="80" w:type="dxa"/>
-              <w:left w:w="120" w:type="dxa"/>
-              <w:bottom w:w="80" w:type="dxa"/>
-              <w:right w:w="120" w:type="dxa"/>
-            </w:tcMar>
-            <w:hideMark/>
-          </w:tcPr>
-          <w:p>
-            <w:pPr>
-              <w:spacing w:before="120" w:after="200"/>
-              <w:rPr>
-                <w:rFonts w:ascii="Calibri" w:eastAsia="Times New Roman" w:hAnsi="Calibri" w:cs="Calibri"/>
-                <w:color w:val="1F2937"/>
-                <w:sz w:val="20"/>
-                <w:szCs w:val="20"/>
-              </w:rPr>
-            </w:pPr>
-            <w:r>
-              <w:rPr>
-                <w:rFonts w:ascii="Calibri" w:eastAsia="Times New Roman" w:hAnsi="Calibri" w:cs="Calibri"/>
-                <w:color w:val="1F2937"/>
-                <w:sz w:val="20"/>
-                <w:szCs w:val="20"/>
-              </w:rPr>
-              <w:t>Long-term maintainability</w:t>
             </w:r>
           </w:p>
         </w:tc>
@@ -12571,7 +9989,7 @@
           <w:sz w:val="22"/>
           <w:szCs w:val="22"/>
         </w:rPr>
-        <w:pict w14:anchorId="4ECC0202">
+        <w:pict w14:anchorId="5101D7DE">
           <v:rect id="_x0000_i1032" style="width:0;height:1.5pt" o:hralign="center" o:hrstd="t" o:hr="t" fillcolor="#a0a0a0" stroked="f"/>
         </w:pict>
       </w:r>
@@ -12647,7 +10065,7 @@
           <w:sz w:val="22"/>
           <w:szCs w:val="22"/>
         </w:rPr>
-        <w:t xml:space="preserve">, </w:t>
+        <w:t xml:space="preserve"> and </w:t>
       </w:r>
       <w:r>
         <w:rPr>
@@ -12667,47 +10085,7 @@
           <w:sz w:val="22"/>
           <w:szCs w:val="22"/>
         </w:rPr>
-        <w:t xml:space="preserve">, the </w:t>
-      </w:r>
-      <w:r>
-        <w:rPr>
-          <w:rFonts w:ascii="Calibri" w:hAnsi="Calibri" w:cs="Calibri"/>
-          <w:b/>
-          <w:bCs/>
-          <w:color w:val="1F2937"/>
-          <w:sz w:val="22"/>
-          <w:szCs w:val="22"/>
-        </w:rPr>
-        <w:t>SMS/LMS login link-up</w:t>
-      </w:r>
-      <w:r>
-        <w:rPr>
-          <w:rFonts w:ascii="Calibri" w:hAnsi="Calibri" w:cs="Calibri"/>
-          <w:color w:val="1F2937"/>
-          <w:sz w:val="22"/>
-          <w:szCs w:val="22"/>
-        </w:rPr>
-        <w:t xml:space="preserve"> and </w:t>
-      </w:r>
-      <w:r>
-        <w:rPr>
-          <w:rFonts w:ascii="Calibri" w:hAnsi="Calibri" w:cs="Calibri"/>
-          <w:b/>
-          <w:bCs/>
-          <w:color w:val="1F2937"/>
-          <w:sz w:val="22"/>
-          <w:szCs w:val="22"/>
-        </w:rPr>
-        <w:t>Asset Lifecycle</w:t>
-      </w:r>
-      <w:r>
-        <w:rPr>
-          <w:rFonts w:ascii="Calibri" w:hAnsi="Calibri" w:cs="Calibri"/>
-          <w:color w:val="1F2937"/>
-          <w:sz w:val="22"/>
-          <w:szCs w:val="22"/>
-        </w:rPr>
-        <w:t xml:space="preserve"> in LMS.</w:t>
+        <w:t>.</w:t>
       </w:r>
     </w:p>
     <w:p>
@@ -12763,9 +10141,9 @@
 <file path=word/numbering.xml><?xml version="1.0" encoding="utf-8"?>
 <w:numbering xmlns:wpc="http://schemas.microsoft.com/office/word/2010/wordprocessingCanvas" xmlns:cx="http://schemas.microsoft.com/office/drawing/2014/chartex" xmlns:cx1="http://schemas.microsoft.com/office/drawing/2015/9/8/chartex" xmlns:cx2="http://schemas.microsoft.com/office/drawing/2015/10/21/chartex" xmlns:cx3="http://schemas.microsoft.com/office/drawing/2016/5/9/chartex" xmlns:cx4="http://schemas.microsoft.com/office/drawing/2016/5/10/chartex" xmlns:cx5="http://schemas.microsoft.com/office/drawing/2016/5/11/chartex" xmlns:cx6="http://schemas.microsoft.com/office/drawing/2016/5/12/chartex" xmlns:cx7="http://schemas.microsoft.com/office/drawing/2016/5/13/chartex" xmlns:cx8="http://schemas.microsoft.com/office/drawing/2016/5/14/chartex" xmlns:mc="http://schemas.openxmlformats.org/markup-compatibility/2006" xmlns:aink="http://schemas.microsoft.com/office/drawing/2016/ink" xmlns:am3d="http://schemas.microsoft.com/office/drawing/2017/model3d" xmlns:o="urn:schemas-microsoft-com:office:office" xmlns:oel="http://schemas.microsoft.com/office/2019/extlst" xmlns:r="http://schemas.openxmlformats.org/officeDocument/2006/relationships" xmlns:m="http://schemas.openxmlformats.org/officeDocument/2006/math" xmlns:v="urn:schemas-microsoft-com:vml" xmlns:wp14="http://schemas.microsoft.com/office/word/2010/wordprocessingDrawing" xmlns:wp="http://schemas.openxmlformats.org/drawingml/2006/wordprocessingDrawing" xmlns:w10="urn:schemas-microsoft-com:office:word" xmlns:w="http://schemas.openxmlformats.org/wordprocessingml/2006/main" xmlns:w14="http://schemas.microsoft.com/office/word/2010/wordml" xmlns:w15="http://schemas.microsoft.com/office/word/2012/wordml" xmlns:w16cex="http://schemas.microsoft.com/office/word/2018/wordml/cex" xmlns:w16cid="http://schemas.microsoft.com/office/word/2016/wordml/cid" xmlns:w16="http://schemas.microsoft.com/office/word/2018/wordml" xmlns:w16du="http://schemas.microsoft.com/office/word/2023/wordml/word16du" xmlns:w16sdtdh="http://schemas.microsoft.com/office/word/2020/wordml/sdtdatahash" xmlns:w16sdtfl="http://schemas.microsoft.com/office/word/2024/wordml/sdtformatlock" xmlns:w16se="http://schemas.microsoft.com/office/word/2015/wordml/symex" xmlns:wpg="http://schemas.microsoft.com/office/word/2010/wordprocessingGroup" xmlns:wpi="http://schemas.microsoft.com/office/word/2010/wordprocessingInk" xmlns:wne="http://schemas.microsoft.com/office/word/2006/wordml" xmlns:wps="http://schemas.microsoft.com/office/word/2010/wordprocessingShape" mc:Ignorable="w14 w15 w16se w16cid w16 w16cex w16sdtdh w16sdtfl w16du wp14">
   <w:abstractNum w:abstractNumId="0" w15:restartNumberingAfterBreak="0">
-    <w:nsid w:val="2A344723"/>
+    <w:nsid w:val="60BB35D5"/>
     <w:multiLevelType w:val="multilevel"/>
-    <w:tmpl w:val="82DC94A8"/>
+    <w:tmpl w:val="D84692C4"/>
     <w:lvl w:ilvl="0">
       <w:start w:val="1"/>
       <w:numFmt w:val="bullet"/>
@@ -12912,9 +10290,9 @@
     </w:lvl>
   </w:abstractNum>
   <w:abstractNum w:abstractNumId="1" w15:restartNumberingAfterBreak="0">
-    <w:nsid w:val="77E975B1"/>
+    <w:nsid w:val="72655545"/>
     <w:multiLevelType w:val="multilevel"/>
-    <w:tmpl w:val="AAC82966"/>
+    <w:tmpl w:val="85EEA582"/>
     <w:lvl w:ilvl="0">
       <w:start w:val="1"/>
       <w:numFmt w:val="bullet"/>
@@ -13061,9 +10439,9 @@
     </w:lvl>
   </w:abstractNum>
   <w:abstractNum w:abstractNumId="2" w15:restartNumberingAfterBreak="0">
-    <w:nsid w:val="7AE2766B"/>
+    <w:nsid w:val="7C2B50DB"/>
     <w:multiLevelType w:val="multilevel"/>
-    <w:tmpl w:val="814E301E"/>
+    <w:tmpl w:val="5E4AAA7C"/>
     <w:lvl w:ilvl="0">
       <w:start w:val="1"/>
       <w:numFmt w:val="bullet"/>
@@ -13209,14 +10587,14 @@
       </w:rPr>
     </w:lvl>
   </w:abstractNum>
-  <w:num w:numId="1" w16cid:durableId="1330913411">
+  <w:num w:numId="1" w16cid:durableId="256712584">
+    <w:abstractNumId w:val="1"/>
+  </w:num>
+  <w:num w:numId="2" w16cid:durableId="1730496102">
     <w:abstractNumId w:val="0"/>
   </w:num>
-  <w:num w:numId="2" w16cid:durableId="734818004">
+  <w:num w:numId="3" w16cid:durableId="106701239">
     <w:abstractNumId w:val="2"/>
-  </w:num>
-  <w:num w:numId="3" w16cid:durableId="1473449028">
-    <w:abstractNumId w:val="1"/>
   </w:num>
 </w:numbering>
 </file>

</xml_diff>